<commit_message>
docs: update technical reference with three-hop architecture and new features
- Add Section 2.3: The Three ANS Roles — maps Namespace Server,
  Authoritative NS, and Recursive Resolver onto agentns code
- Rename old 2.3 → 2.4 (Why Single Binary), updated to explain role boundaries
- Add Section 4.2: Namespace Validation Flow with HTTP 403 examples
- Renumber 4.2/4.3/4.4 → 4.3/4.4/4.5 accordingly
- Add Section 5.7: geocoder.py — 4-step city resolution chain, Nominatim
  rate limiting, cache, and worked examples
- Update CITY_COORDS count: 60+ → 120+ cities
- Add AGENTNS_GEOCODING to configuration table (Section 10)
- Add HTTP 403 to API error codes table (Section 11)
- Expand error handling table: namespace mismatch, Nominatim failures,
  split city-not-in-table into registration vs resolve contexts
- Note agent_name as issued URN in registration flow description

Co-Authored-By: Claude Sonnet 4.6 <noreply@anthropic.com>
</commit_message>
<xml_diff>
--- a/agentns_technical_reference.docx
+++ b/agentns_technical_reference.docx
@@ -1531,7 +1531,496 @@
           <w:sz w:val="28"/>
           <w:szCs w:val="28"/>
         </w:rPr>
-        <w:t xml:space="preserve">2.3  Why Single Binary</w:t>
+        <w:t xml:space="preserve">2.3  The Three ANS Roles</w:t>
+      </w:r>
+    </w:p>
+    <w:p>
+      <w:pPr>
+        <w:spacing w:after="100" w:before="0"/>
+      </w:pPr>
+      <w:r>
+        <w:rPr>
+          <w:rFonts w:ascii="Arial" w:cs="Arial" w:eastAsia="Arial" w:hAnsi="Arial"/>
+          <w:b w:val="false"/>
+          <w:bCs w:val="false"/>
+          <w:color w:val="374151"/>
+          <w:sz w:val="22"/>
+          <w:szCs w:val="22"/>
+        </w:rPr>
+        <w:t xml:space="preserve">Every Agent Name Service — whether distributed across three servers or collapsed into one process — has three conceptually distinct roles. Understanding them is essential to understanding how agentns works:</w:t>
+      </w:r>
+    </w:p>
+    <w:p>
+      <w:pPr>
+        <w:spacing w:after="80" w:before="0"/>
+      </w:pPr>
+      <w:r>
+        <w:t xml:space="preserve"/>
+      </w:r>
+    </w:p>
+    <w:tbl>
+      <w:tblPr>
+        <w:tblW w:type="dxa" w:w="9360"/>
+        <w:tblBorders>
+          <w:top w:val="single" w:color="auto" w:sz="4"/>
+          <w:left w:val="single" w:color="auto" w:sz="4"/>
+          <w:bottom w:val="single" w:color="auto" w:sz="4"/>
+          <w:right w:val="single" w:color="auto" w:sz="4"/>
+          <w:insideH w:val="single" w:color="auto" w:sz="4"/>
+          <w:insideV w:val="single" w:color="auto" w:sz="4"/>
+        </w:tblBorders>
+      </w:tblPr>
+      <w:tblGrid>
+        <w:gridCol w:w="2200"/>
+        <w:gridCol w:w="3800"/>
+        <w:gridCol w:w="3360"/>
+      </w:tblGrid>
+      <w:tr>
+        <w:tc>
+          <w:tcPr>
+            <w:tcW w:type="dxa" w:w="2200"/>
+            <w:tcBorders>
+              <w:top w:val="single" w:color="FFFFFF" w:sz="1"/>
+              <w:left w:val="single" w:color="FFFFFF" w:sz="1"/>
+              <w:bottom w:val="single" w:color="FFFFFF" w:sz="1"/>
+              <w:right w:val="single" w:color="FFFFFF" w:sz="1"/>
+            </w:tcBorders>
+            <w:shd w:fill="1B3A6B" w:val="clear"/>
+            <w:tcMar>
+              <w:top w:type="dxa" w:w="100"/>
+              <w:left w:type="dxa" w:w="150"/>
+              <w:bottom w:type="dxa" w:w="100"/>
+              <w:right w:type="dxa" w:w="150"/>
+            </w:tcMar>
+          </w:tcPr>
+          <w:p>
+            <w:pPr>
+              <w:spacing w:after="0" w:before="0"/>
+            </w:pPr>
+            <w:r>
+              <w:rPr>
+                <w:rFonts w:ascii="Arial" w:cs="Arial" w:eastAsia="Arial" w:hAnsi="Arial"/>
+                <w:b/>
+                <w:bCs/>
+                <w:color w:val="FFFFFF"/>
+                <w:sz w:val="20"/>
+                <w:szCs w:val="20"/>
+              </w:rPr>
+              <w:t xml:space="preserve">Role</w:t>
+            </w:r>
+          </w:p>
+        </w:tc>
+        <w:tc>
+          <w:tcPr>
+            <w:tcW w:type="dxa" w:w="3800"/>
+            <w:tcBorders>
+              <w:top w:val="single" w:color="FFFFFF" w:sz="1"/>
+              <w:left w:val="single" w:color="FFFFFF" w:sz="1"/>
+              <w:bottom w:val="single" w:color="FFFFFF" w:sz="1"/>
+              <w:right w:val="single" w:color="FFFFFF" w:sz="1"/>
+            </w:tcBorders>
+            <w:shd w:fill="1B3A6B" w:val="clear"/>
+            <w:tcMar>
+              <w:top w:type="dxa" w:w="100"/>
+              <w:left w:type="dxa" w:w="150"/>
+              <w:bottom w:type="dxa" w:w="100"/>
+              <w:right w:type="dxa" w:w="150"/>
+            </w:tcMar>
+          </w:tcPr>
+          <w:p>
+            <w:pPr>
+              <w:spacing w:after="0" w:before="0"/>
+            </w:pPr>
+            <w:r>
+              <w:rPr>
+                <w:rFonts w:ascii="Arial" w:cs="Arial" w:eastAsia="Arial" w:hAnsi="Arial"/>
+                <w:b/>
+                <w:bCs/>
+                <w:color w:val="FFFFFF"/>
+                <w:sz w:val="20"/>
+                <w:szCs w:val="20"/>
+              </w:rPr>
+              <w:t xml:space="preserve">Responsibility</w:t>
+            </w:r>
+          </w:p>
+        </w:tc>
+        <w:tc>
+          <w:tcPr>
+            <w:tcW w:type="dxa" w:w="3360"/>
+            <w:tcBorders>
+              <w:top w:val="single" w:color="FFFFFF" w:sz="1"/>
+              <w:left w:val="single" w:color="FFFFFF" w:sz="1"/>
+              <w:bottom w:val="single" w:color="FFFFFF" w:sz="1"/>
+              <w:right w:val="single" w:color="FFFFFF" w:sz="1"/>
+            </w:tcBorders>
+            <w:shd w:fill="1B3A6B" w:val="clear"/>
+            <w:tcMar>
+              <w:top w:type="dxa" w:w="100"/>
+              <w:left w:type="dxa" w:w="150"/>
+              <w:bottom w:type="dxa" w:w="100"/>
+              <w:right w:type="dxa" w:w="150"/>
+            </w:tcMar>
+          </w:tcPr>
+          <w:p>
+            <w:pPr>
+              <w:spacing w:after="0" w:before="0"/>
+            </w:pPr>
+            <w:r>
+              <w:rPr>
+                <w:rFonts w:ascii="Arial" w:cs="Arial" w:eastAsia="Arial" w:hAnsi="Arial"/>
+                <w:b/>
+                <w:bCs/>
+                <w:color w:val="FFFFFF"/>
+                <w:sz w:val="20"/>
+                <w:szCs w:val="20"/>
+              </w:rPr>
+              <w:t xml:space="preserve">agentns code</w:t>
+            </w:r>
+          </w:p>
+        </w:tc>
+      </w:tr>
+      <w:tr>
+        <w:tc>
+          <w:tcPr>
+            <w:tcW w:type="dxa" w:w="2200"/>
+            <w:tcBorders>
+              <w:top w:val="single" w:color="D1D5DB" w:sz="1"/>
+              <w:left w:val="single" w:color="D1D5DB" w:sz="1"/>
+              <w:bottom w:val="single" w:color="D1D5DB" w:sz="1"/>
+              <w:right w:val="single" w:color="D1D5DB" w:sz="1"/>
+            </w:tcBorders>
+            <w:shd w:fill="FFFFFF" w:val="clear"/>
+            <w:tcMar>
+              <w:top w:type="dxa" w:w="80"/>
+              <w:left w:type="dxa" w:w="150"/>
+              <w:bottom w:type="dxa" w:w="80"/>
+              <w:right w:type="dxa" w:w="150"/>
+            </w:tcMar>
+          </w:tcPr>
+          <w:p>
+            <w:pPr>
+              <w:spacing w:after="0" w:before="0"/>
+            </w:pPr>
+            <w:r>
+              <w:rPr>
+                <w:rFonts w:ascii="Arial" w:cs="Arial" w:eastAsia="Arial" w:hAnsi="Arial"/>
+                <w:color w:val="374151"/>
+                <w:sz w:val="20"/>
+                <w:szCs w:val="20"/>
+              </w:rPr>
+              <w:t xml:space="preserve">Namespace Server</w:t>
+            </w:r>
+          </w:p>
+        </w:tc>
+        <w:tc>
+          <w:tcPr>
+            <w:tcW w:type="dxa" w:w="3800"/>
+            <w:tcBorders>
+              <w:top w:val="single" w:color="D1D5DB" w:sz="1"/>
+              <w:left w:val="single" w:color="D1D5DB" w:sz="1"/>
+              <w:bottom w:val="single" w:color="D1D5DB" w:sz="1"/>
+              <w:right w:val="single" w:color="D1D5DB" w:sz="1"/>
+            </w:tcBorders>
+            <w:shd w:fill="FFFFFF" w:val="clear"/>
+            <w:tcMar>
+              <w:top w:type="dxa" w:w="80"/>
+              <w:left w:type="dxa" w:w="150"/>
+              <w:bottom w:type="dxa" w:w="80"/>
+              <w:right w:type="dxa" w:w="150"/>
+            </w:tcMar>
+          </w:tcPr>
+          <w:p>
+            <w:pPr>
+              <w:spacing w:after="0" w:before="0"/>
+            </w:pPr>
+            <w:r>
+              <w:rPr>
+                <w:rFonts w:ascii="Arial" w:cs="Arial" w:eastAsia="Arial" w:hAnsi="Arial"/>
+                <w:color w:val="374151"/>
+                <w:sz w:val="20"/>
+                <w:szCs w:val="20"/>
+              </w:rPr>
+              <w:t xml:space="preserve">Target Agent registers its deployment and receives a canonical AI Agent Name (URN). The NS owns and issues URNs — it is the authoritative source of agent identity.</w:t>
+            </w:r>
+          </w:p>
+        </w:tc>
+        <w:tc>
+          <w:tcPr>
+            <w:tcW w:type="dxa" w:w="3360"/>
+            <w:tcBorders>
+              <w:top w:val="single" w:color="D1D5DB" w:sz="1"/>
+              <w:left w:val="single" w:color="D1D5DB" w:sz="1"/>
+              <w:bottom w:val="single" w:color="D1D5DB" w:sz="1"/>
+              <w:right w:val="single" w:color="D1D5DB" w:sz="1"/>
+            </w:tcBorders>
+            <w:shd w:fill="FFFFFF" w:val="clear"/>
+            <w:tcMar>
+              <w:top w:type="dxa" w:w="80"/>
+              <w:left w:type="dxa" w:w="150"/>
+              <w:bottom w:type="dxa" w:w="80"/>
+              <w:right w:type="dxa" w:w="150"/>
+            </w:tcMar>
+          </w:tcPr>
+          <w:p>
+            <w:pPr>
+              <w:spacing w:after="0" w:before="0"/>
+            </w:pPr>
+            <w:r>
+              <w:rPr>
+                <w:rFonts w:ascii="Arial" w:cs="Arial" w:eastAsia="Arial" w:hAnsi="Arial"/>
+                <w:color w:val="374151"/>
+                <w:sz w:val="20"/>
+                <w:szCs w:val="20"/>
+              </w:rPr>
+              <w:t xml:space="preserve">POST /register → build_urn() → returns agent_name in response</w:t>
+            </w:r>
+          </w:p>
+        </w:tc>
+      </w:tr>
+      <w:tr>
+        <w:tc>
+          <w:tcPr>
+            <w:tcW w:type="dxa" w:w="2200"/>
+            <w:tcBorders>
+              <w:top w:val="single" w:color="D1D5DB" w:sz="1"/>
+              <w:left w:val="single" w:color="D1D5DB" w:sz="1"/>
+              <w:bottom w:val="single" w:color="D1D5DB" w:sz="1"/>
+              <w:right w:val="single" w:color="D1D5DB" w:sz="1"/>
+            </w:tcBorders>
+            <w:shd w:fill="EFF6FF" w:val="clear"/>
+            <w:tcMar>
+              <w:top w:type="dxa" w:w="80"/>
+              <w:left w:type="dxa" w:w="150"/>
+              <w:bottom w:type="dxa" w:w="80"/>
+              <w:right w:type="dxa" w:w="150"/>
+            </w:tcMar>
+          </w:tcPr>
+          <w:p>
+            <w:pPr>
+              <w:spacing w:after="0" w:before="0"/>
+            </w:pPr>
+            <w:r>
+              <w:rPr>
+                <w:rFonts w:ascii="Arial" w:cs="Arial" w:eastAsia="Arial" w:hAnsi="Arial"/>
+                <w:color w:val="374151"/>
+                <w:sz w:val="20"/>
+                <w:szCs w:val="20"/>
+              </w:rPr>
+              <w:t xml:space="preserve">Authoritative Name Server</w:t>
+            </w:r>
+          </w:p>
+        </w:tc>
+        <w:tc>
+          <w:tcPr>
+            <w:tcW w:type="dxa" w:w="3800"/>
+            <w:tcBorders>
+              <w:top w:val="single" w:color="D1D5DB" w:sz="1"/>
+              <w:left w:val="single" w:color="D1D5DB" w:sz="1"/>
+              <w:bottom w:val="single" w:color="D1D5DB" w:sz="1"/>
+              <w:right w:val="single" w:color="D1D5DB" w:sz="1"/>
+            </w:tcBorders>
+            <w:shd w:fill="EFF6FF" w:val="clear"/>
+            <w:tcMar>
+              <w:top w:type="dxa" w:w="80"/>
+              <w:left w:type="dxa" w:w="150"/>
+              <w:bottom w:type="dxa" w:w="80"/>
+              <w:right w:type="dxa" w:w="150"/>
+            </w:tcMar>
+          </w:tcPr>
+          <w:p>
+            <w:pPr>
+              <w:spacing w:after="0" w:before="0"/>
+            </w:pPr>
+            <w:r>
+              <w:rPr>
+                <w:rFonts w:ascii="Arial" w:cs="Arial" w:eastAsia="Arial" w:hAnsi="Arial"/>
+                <w:color w:val="374151"/>
+                <w:sz w:val="20"/>
+                <w:szCs w:val="20"/>
+              </w:rPr>
+              <w:t xml:space="preserve">Knows the live status of the environment. When asked for an agent, it checks health, load, and location in real time and generates a Tailored End-Point — not a static URL but the best endpoint right now.</w:t>
+            </w:r>
+          </w:p>
+        </w:tc>
+        <w:tc>
+          <w:tcPr>
+            <w:tcW w:type="dxa" w:w="3360"/>
+            <w:tcBorders>
+              <w:top w:val="single" w:color="D1D5DB" w:sz="1"/>
+              <w:left w:val="single" w:color="D1D5DB" w:sz="1"/>
+              <w:bottom w:val="single" w:color="D1D5DB" w:sz="1"/>
+              <w:right w:val="single" w:color="D1D5DB" w:sz="1"/>
+            </w:tcBorders>
+            <w:shd w:fill="EFF6FF" w:val="clear"/>
+            <w:tcMar>
+              <w:top w:type="dxa" w:w="80"/>
+              <w:left w:type="dxa" w:w="150"/>
+              <w:bottom w:type="dxa" w:w="80"/>
+              <w:right w:type="dxa" w:w="150"/>
+            </w:tcMar>
+          </w:tcPr>
+          <w:p>
+            <w:pPr>
+              <w:spacing w:after="0" w:before="0"/>
+            </w:pPr>
+            <w:r>
+              <w:rPr>
+                <w:rFonts w:ascii="Arial" w:cs="Arial" w:eastAsia="Arial" w:hAnsi="Arial"/>
+                <w:color w:val="374151"/>
+                <w:sz w:val="20"/>
+                <w:szCs w:val="20"/>
+              </w:rPr>
+              <w:t xml:space="preserve">Background _health_loop() + rank_servers() + calculate_ttl()</w:t>
+            </w:r>
+          </w:p>
+        </w:tc>
+      </w:tr>
+      <w:tr>
+        <w:tc>
+          <w:tcPr>
+            <w:tcW w:type="dxa" w:w="2200"/>
+            <w:tcBorders>
+              <w:top w:val="single" w:color="D1D5DB" w:sz="1"/>
+              <w:left w:val="single" w:color="D1D5DB" w:sz="1"/>
+              <w:bottom w:val="single" w:color="D1D5DB" w:sz="1"/>
+              <w:right w:val="single" w:color="D1D5DB" w:sz="1"/>
+            </w:tcBorders>
+            <w:shd w:fill="FFFFFF" w:val="clear"/>
+            <w:tcMar>
+              <w:top w:type="dxa" w:w="80"/>
+              <w:left w:type="dxa" w:w="150"/>
+              <w:bottom w:type="dxa" w:w="80"/>
+              <w:right w:type="dxa" w:w="150"/>
+            </w:tcMar>
+          </w:tcPr>
+          <w:p>
+            <w:pPr>
+              <w:spacing w:after="0" w:before="0"/>
+            </w:pPr>
+            <w:r>
+              <w:rPr>
+                <w:rFonts w:ascii="Arial" w:cs="Arial" w:eastAsia="Arial" w:hAnsi="Arial"/>
+                <w:color w:val="374151"/>
+                <w:sz w:val="20"/>
+                <w:szCs w:val="20"/>
+              </w:rPr>
+              <w:t xml:space="preserve">Recursive Resolver</w:t>
+            </w:r>
+          </w:p>
+        </w:tc>
+        <w:tc>
+          <w:tcPr>
+            <w:tcW w:type="dxa" w:w="3800"/>
+            <w:tcBorders>
+              <w:top w:val="single" w:color="D1D5DB" w:sz="1"/>
+              <w:left w:val="single" w:color="D1D5DB" w:sz="1"/>
+              <w:bottom w:val="single" w:color="D1D5DB" w:sz="1"/>
+              <w:right w:val="single" w:color="D1D5DB" w:sz="1"/>
+            </w:tcBorders>
+            <w:shd w:fill="FFFFFF" w:val="clear"/>
+            <w:tcMar>
+              <w:top w:type="dxa" w:w="80"/>
+              <w:left w:type="dxa" w:w="150"/>
+              <w:bottom w:type="dxa" w:w="80"/>
+              <w:right w:type="dxa" w:w="150"/>
+            </w:tcMar>
+          </w:tcPr>
+          <w:p>
+            <w:pPr>
+              <w:spacing w:after="0" w:before="0"/>
+            </w:pPr>
+            <w:r>
+              <w:rPr>
+                <w:rFonts w:ascii="Arial" w:cs="Arial" w:eastAsia="Arial" w:hAnsi="Arial"/>
+                <w:color w:val="374151"/>
+                <w:sz w:val="20"/>
+                <w:szCs w:val="20"/>
+              </w:rPr>
+              <w:t xml:space="preserve">Entry point for the Requester Agent. Accepts a URN query, validates it belongs to this nameserver, checks cache, delegates to the Auth NS logic, and returns the Tailored End-Point. The requester never talks to the NS or Auth NS directly.</w:t>
+            </w:r>
+          </w:p>
+        </w:tc>
+        <w:tc>
+          <w:tcPr>
+            <w:tcW w:type="dxa" w:w="3360"/>
+            <w:tcBorders>
+              <w:top w:val="single" w:color="D1D5DB" w:sz="1"/>
+              <w:left w:val="single" w:color="D1D5DB" w:sz="1"/>
+              <w:bottom w:val="single" w:color="D1D5DB" w:sz="1"/>
+              <w:right w:val="single" w:color="D1D5DB" w:sz="1"/>
+            </w:tcBorders>
+            <w:shd w:fill="FFFFFF" w:val="clear"/>
+            <w:tcMar>
+              <w:top w:type="dxa" w:w="80"/>
+              <w:left w:type="dxa" w:w="150"/>
+              <w:bottom w:type="dxa" w:w="80"/>
+              <w:right w:type="dxa" w:w="150"/>
+            </w:tcMar>
+          </w:tcPr>
+          <w:p>
+            <w:pPr>
+              <w:spacing w:after="0" w:before="0"/>
+            </w:pPr>
+            <w:r>
+              <w:rPr>
+                <w:rFonts w:ascii="Arial" w:cs="Arial" w:eastAsia="Arial" w:hAnsi="Arial"/>
+                <w:color w:val="374151"/>
+                <w:sz w:val="20"/>
+                <w:szCs w:val="20"/>
+              </w:rPr>
+              <w:t xml:space="preserve">POST /resolve → parse_urn() → cache → rank_servers() → response</w:t>
+            </w:r>
+          </w:p>
+        </w:tc>
+      </w:tr>
+    </w:tbl>
+    <w:p>
+      <w:pPr>
+        <w:spacing w:after="120" w:before="0"/>
+      </w:pPr>
+      <w:r>
+        <w:t xml:space="preserve"/>
+      </w:r>
+    </w:p>
+    <w:p>
+      <w:pPr>
+        <w:spacing w:after="100" w:before="0"/>
+      </w:pPr>
+      <w:r>
+        <w:rPr>
+          <w:rFonts w:ascii="Arial" w:cs="Arial" w:eastAsia="Arial" w:hAnsi="Arial"/>
+          <w:b w:val="false"/>
+          <w:bCs w:val="false"/>
+          <w:color w:val="374151"/>
+          <w:sz w:val="22"/>
+          <w:szCs w:val="22"/>
+        </w:rPr>
+        <w:t xml:space="preserve">The namespace validation in POST /resolve enforces the Resolver role correctly: if the URN's TLD does not match this instance's AGENTNS_TLD, agentns returns HTTP 403 — it is literally the wrong nameserver for that URN, exactly as DNS would reject a query for a zone it does not own.</w:t>
+      </w:r>
+    </w:p>
+    <w:p>
+      <w:pPr>
+        <w:spacing w:after="160" w:before="0"/>
+      </w:pPr>
+      <w:r>
+        <w:t xml:space="preserve"/>
+      </w:r>
+    </w:p>
+    <w:p>
+      <w:pPr>
+        <w:pStyle w:val="Heading2"/>
+        <w:spacing w:after="120" w:before="320"/>
+      </w:pPr>
+      <w:r>
+        <w:rPr>
+          <w:rFonts w:ascii="Arial" w:cs="Arial" w:eastAsia="Arial" w:hAnsi="Arial"/>
+          <w:b/>
+          <w:bCs/>
+          <w:color w:val="0E6B8A"/>
+          <w:sz w:val="28"/>
+          <w:szCs w:val="28"/>
+        </w:rPr>
+        <w:t xml:space="preserve">2.4  Why Single Binary</w:t>
       </w:r>
     </w:p>
     <w:p>
@@ -1643,7 +2132,7 @@
           <w:sz w:val="22"/>
           <w:szCs w:val="22"/>
         </w:rPr>
-        <w:t xml:space="preserve">agentns collapses all three into one in-process function call chain, eliminating the network overhead of the middle hops while preserving the same logical resolution model.</w:t>
+        <w:t xml:space="preserve">agentns collapses all three into one in-process function call chain, eliminating the network overhead of the middle hops while preserving the same logical resolution model. Each role still has a clear boundary: registration (NS), health + ranking (Auth NS), and query entry (Resolver) — they are just function calls rather than network round-trips.</w:t>
       </w:r>
     </w:p>
     <w:p>
@@ -2757,7 +3246,7 @@
           <w:sz w:val="22"/>
           <w:szCs w:val="22"/>
         </w:rPr>
-        <w:t xml:space="preserve">Key behavior: If the same (label, endpoint) pair is registered again, the existing entry is updated, not duplicated. If a new endpoint is registered under the same label, it is appended — creating a replica group. This is how multi-region failover is achieved without any configuration change.</w:t>
+        <w:t xml:space="preserve">Key behavior: If the same (label, endpoint) pair is registered again, the existing entry is updated, not duplicated. If a new endpoint is registered under the same label, it is appended — creating a replica group. This is how multi-region failover is achieved without any configuration change. The agent_name field in the response is the URN issued by the Namespace Server role — the caller can store this as its permanent AI Agent Name.</w:t>
       </w:r>
     </w:p>
     <w:p>
@@ -2782,7 +3271,7 @@
           <w:sz w:val="28"/>
           <w:szCs w:val="28"/>
         </w:rPr>
-        <w:t xml:space="preserve">4.2  Resolution Flow — Cache Hit</w:t>
+        <w:t xml:space="preserve">4.2  Namespace Validation Flow</w:t>
       </w:r>
     </w:p>
     <w:p>
@@ -2798,7 +3287,7 @@
           <w:sz w:val="22"/>
           <w:szCs w:val="22"/>
         </w:rPr>
-        <w:t xml:space="preserve">The fast path. A repeated resolution within the TTL window returns a cached result in under 1 ms:</w:t>
+        <w:t xml:space="preserve">When a URN is provided (not a plain label), agentns first validates that the URN belongs to this instance before doing any lookup. This is the Recursive Resolver checking it owns the zone:</w:t>
       </w:r>
     </w:p>
     <w:p>
@@ -2853,7 +3342,7 @@
                 <w:sz w:val="18"/>
                 <w:szCs w:val="18"/>
               </w:rPr>
-              <w:t xml:space="preserve">POST /resolve  { 'agent_name': 'urn:...:emailer', 'requester_context': {...} }</w:t>
+              <w:t xml:space="preserve">POST /resolve  { 'agent_name': 'urn:wrong.com:sales:emailer' }</w:t>
             </w:r>
           </w:p>
           <w:p>
@@ -2881,105 +3370,35 @@
                 <w:sz w:val="18"/>
                 <w:szCs w:val="18"/>
               </w:rPr>
-              <w:t xml:space="preserve">Step 1  parse_urn()  →  label = 'emailer'</w:t>
-            </w:r>
-          </w:p>
-          <w:p>
-            <w:pPr>
-              <w:spacing w:after="0" w:before="0"/>
-            </w:pPr>
-            <w:r>
-              <w:rPr>
-                <w:rFonts w:ascii="Courier New" w:cs="Courier New" w:eastAsia="Courier New" w:hAnsi="Courier New"/>
-                <w:color w:val="1F2937"/>
-                <w:sz w:val="18"/>
-                <w:szCs w:val="18"/>
-              </w:rPr>
-              <w:t xml:space="preserve">Step 2  Build cache key: MD5(label | sorted_protocols | location_json)</w:t>
-            </w:r>
-          </w:p>
-          <w:p>
-            <w:pPr>
-              <w:spacing w:after="0" w:before="0"/>
-            </w:pPr>
-            <w:r>
-              <w:rPr>
-                <w:rFonts w:ascii="Courier New" w:cs="Courier New" w:eastAsia="Courier New" w:hAnsi="Courier New"/>
-                <w:color w:val="1F2937"/>
-                <w:sz w:val="18"/>
-                <w:szCs w:val="18"/>
-              </w:rPr>
-              <w:t xml:space="preserve">         → deterministic hex digest, e.g. 'a3f2c1d8...'</w:t>
-            </w:r>
-          </w:p>
-          <w:p>
-            <w:pPr>
-              <w:spacing w:after="0" w:before="0"/>
-            </w:pPr>
-            <w:r>
-              <w:rPr>
-                <w:rFonts w:ascii="Courier New" w:cs="Courier New" w:eastAsia="Courier New" w:hAnsi="Courier New"/>
-                <w:color w:val="1F2937"/>
-                <w:sz w:val="18"/>
-                <w:szCs w:val="18"/>
-              </w:rPr>
-              <w:t xml:space="preserve">Step 3  _cache.get(key)</w:t>
-            </w:r>
-          </w:p>
-          <w:p>
-            <w:pPr>
-              <w:spacing w:after="0" w:before="0"/>
-            </w:pPr>
-            <w:r>
-              <w:rPr>
-                <w:rFonts w:ascii="Courier New" w:cs="Courier New" w:eastAsia="Courier New" w:hAnsi="Courier New"/>
-                <w:color w:val="1F2937"/>
-                <w:sz w:val="18"/>
-                <w:szCs w:val="18"/>
-              </w:rPr>
-              <w:t xml:space="preserve">         Entry found AND monotonic() &lt; expiry → cache HIT</w:t>
-            </w:r>
-          </w:p>
-          <w:p>
-            <w:pPr>
-              <w:spacing w:after="0" w:before="0"/>
-            </w:pPr>
-            <w:r>
-              <w:rPr>
-                <w:rFonts w:ascii="Courier New" w:cs="Courier New" w:eastAsia="Courier New" w:hAnsi="Courier New"/>
-                <w:color w:val="1F2937"/>
-                <w:sz w:val="18"/>
-                <w:szCs w:val="18"/>
-              </w:rPr>
-              <w:t xml:space="preserve">         Increment hits counter</w:t>
-            </w:r>
-          </w:p>
-          <w:p>
-            <w:pPr>
-              <w:spacing w:after="0" w:before="0"/>
-            </w:pPr>
-            <w:r>
-              <w:rPr>
-                <w:rFonts w:ascii="Courier New" w:cs="Courier New" w:eastAsia="Courier New" w:hAnsi="Courier New"/>
-                <w:color w:val="1F2937"/>
-                <w:sz w:val="18"/>
-                <w:szCs w:val="18"/>
-              </w:rPr>
-              <w:t xml:space="preserve">Step 4  Inject resolution_time_ms, set cached=True</w:t>
-            </w:r>
-          </w:p>
-          <w:p>
-            <w:pPr>
-              <w:spacing w:after="0" w:before="0"/>
-            </w:pPr>
-            <w:r>
-              <w:rPr>
-                <w:rFonts w:ascii="Courier New" w:cs="Courier New" w:eastAsia="Courier New" w:hAnsi="Courier New"/>
-                <w:color w:val="1F2937"/>
-                <w:sz w:val="18"/>
-                <w:szCs w:val="18"/>
-              </w:rPr>
-              <w:t xml:space="preserve">Step 5  Return immediately</w:t>
+              <w:t xml:space="preserve">Step 1  parse_urn()  →  tld='wrong.com'  namespace='sales'  label='emailer'</w:t>
+            </w:r>
+          </w:p>
+          <w:p>
+            <w:pPr>
+              <w:spacing w:after="0" w:before="0"/>
+            </w:pPr>
+            <w:r>
+              <w:rPr>
+                <w:rFonts w:ascii="Courier New" w:cs="Courier New" w:eastAsia="Courier New" w:hAnsi="Courier New"/>
+                <w:color w:val="1F2937"/>
+                <w:sz w:val="18"/>
+                <w:szCs w:val="18"/>
+              </w:rPr>
+              <w:t xml:space="preserve">Step 2  TLD check: 'wrong.com' != AGENTNS_TLD ('agentns.local')</w:t>
+            </w:r>
+          </w:p>
+          <w:p>
+            <w:pPr>
+              <w:spacing w:after="0" w:before="0"/>
+            </w:pPr>
+            <w:r>
+              <w:rPr>
+                <w:rFonts w:ascii="Courier New" w:cs="Courier New" w:eastAsia="Courier New" w:hAnsi="Courier New"/>
+                <w:color w:val="1F2937"/>
+                <w:sz w:val="18"/>
+                <w:szCs w:val="18"/>
+              </w:rPr>
+              <w:t xml:space="preserve">         → HTTP 403  'You are asking the wrong nameserver.'</w:t>
             </w:r>
           </w:p>
           <w:p>
@@ -3007,12 +3426,162 @@
                 <w:sz w:val="18"/>
                 <w:szCs w:val="18"/>
               </w:rPr>
-              <w:t xml:space="preserve">Typical round-trip: &lt; 1 ms (in-process dict lookup + MD5)</w:t>
+              <w:t xml:space="preserve">POST /resolve  { 'agent_name': 'urn:agentns.local:other-app:emailer' }</w:t>
+            </w:r>
+          </w:p>
+          <w:p>
+            <w:pPr>
+              <w:spacing w:after="0" w:before="0"/>
+            </w:pPr>
+            <w:r>
+              <w:rPr>
+                <w:rFonts w:ascii="Courier New" w:cs="Courier New" w:eastAsia="Courier New" w:hAnsi="Courier New"/>
+                <w:color w:val="1F2937"/>
+                <w:sz w:val="18"/>
+                <w:szCs w:val="18"/>
+              </w:rPr>
+              <w:t xml:space="preserve"> </w:t>
+            </w:r>
+          </w:p>
+          <w:p>
+            <w:pPr>
+              <w:spacing w:after="0" w:before="0"/>
+            </w:pPr>
+            <w:r>
+              <w:rPr>
+                <w:rFonts w:ascii="Courier New" w:cs="Courier New" w:eastAsia="Courier New" w:hAnsi="Courier New"/>
+                <w:color w:val="1F2937"/>
+                <w:sz w:val="18"/>
+                <w:szCs w:val="18"/>
+              </w:rPr>
+              <w:t xml:space="preserve">Step 1  parse_urn()  →  tld='agentns.local'  namespace='other-app'  label='emailer'</w:t>
+            </w:r>
+          </w:p>
+          <w:p>
+            <w:pPr>
+              <w:spacing w:after="0" w:before="0"/>
+            </w:pPr>
+            <w:r>
+              <w:rPr>
+                <w:rFonts w:ascii="Courier New" w:cs="Courier New" w:eastAsia="Courier New" w:hAnsi="Courier New"/>
+                <w:color w:val="1F2937"/>
+                <w:sz w:val="18"/>
+                <w:szCs w:val="18"/>
+              </w:rPr>
+              <w:t xml:space="preserve">Step 2  TLD check:       PASS (matches AGENTNS_TLD)</w:t>
+            </w:r>
+          </w:p>
+          <w:p>
+            <w:pPr>
+              <w:spacing w:after="0" w:before="0"/>
+            </w:pPr>
+            <w:r>
+              <w:rPr>
+                <w:rFonts w:ascii="Courier New" w:cs="Courier New" w:eastAsia="Courier New" w:hAnsi="Courier New"/>
+                <w:color w:val="1F2937"/>
+                <w:sz w:val="18"/>
+                <w:szCs w:val="18"/>
+              </w:rPr>
+              <w:t xml:space="preserve">Step 3  Namespace check: 'other-app' != AGENTNS_NAMESPACE ('agents.local')</w:t>
+            </w:r>
+          </w:p>
+          <w:p>
+            <w:pPr>
+              <w:spacing w:after="0" w:before="0"/>
+            </w:pPr>
+            <w:r>
+              <w:rPr>
+                <w:rFonts w:ascii="Courier New" w:cs="Courier New" w:eastAsia="Courier New" w:hAnsi="Courier New"/>
+                <w:color w:val="1F2937"/>
+                <w:sz w:val="18"/>
+                <w:szCs w:val="18"/>
+              </w:rPr>
+              <w:t xml:space="preserve">         → HTTP 403  'This instance handles namespace agents.local, not other-app.'</w:t>
+            </w:r>
+          </w:p>
+          <w:p>
+            <w:pPr>
+              <w:spacing w:after="0" w:before="0"/>
+            </w:pPr>
+            <w:r>
+              <w:rPr>
+                <w:rFonts w:ascii="Courier New" w:cs="Courier New" w:eastAsia="Courier New" w:hAnsi="Courier New"/>
+                <w:color w:val="1F2937"/>
+                <w:sz w:val="18"/>
+                <w:szCs w:val="18"/>
+              </w:rPr>
+              <w:t xml:space="preserve"> </w:t>
+            </w:r>
+          </w:p>
+          <w:p>
+            <w:pPr>
+              <w:spacing w:after="0" w:before="0"/>
+            </w:pPr>
+            <w:r>
+              <w:rPr>
+                <w:rFonts w:ascii="Courier New" w:cs="Courier New" w:eastAsia="Courier New" w:hAnsi="Courier New"/>
+                <w:color w:val="1F2937"/>
+                <w:sz w:val="18"/>
+                <w:szCs w:val="18"/>
+              </w:rPr>
+              <w:t xml:space="preserve">POST /resolve  { 'label': 'emailer' }</w:t>
+            </w:r>
+          </w:p>
+          <w:p>
+            <w:pPr>
+              <w:spacing w:after="0" w:before="0"/>
+            </w:pPr>
+            <w:r>
+              <w:rPr>
+                <w:rFonts w:ascii="Courier New" w:cs="Courier New" w:eastAsia="Courier New" w:hAnsi="Courier New"/>
+                <w:color w:val="1F2937"/>
+                <w:sz w:val="18"/>
+                <w:szCs w:val="18"/>
+              </w:rPr>
+              <w:t xml:space="preserve"> </w:t>
+            </w:r>
+          </w:p>
+          <w:p>
+            <w:pPr>
+              <w:spacing w:after="0" w:before="0"/>
+            </w:pPr>
+            <w:r>
+              <w:rPr>
+                <w:rFonts w:ascii="Courier New" w:cs="Courier New" w:eastAsia="Courier New" w:hAnsi="Courier New"/>
+                <w:color w:val="1F2937"/>
+                <w:sz w:val="18"/>
+                <w:szCs w:val="18"/>
+              </w:rPr>
+              <w:t xml:space="preserve">  Plain label — no URN → namespace check skipped entirely → proceeds to lookup</w:t>
             </w:r>
           </w:p>
         </w:tc>
       </w:tr>
     </w:tbl>
+    <w:p>
+      <w:pPr>
+        <w:spacing w:after="120" w:before="0"/>
+      </w:pPr>
+      <w:r>
+        <w:t xml:space="preserve"/>
+      </w:r>
+    </w:p>
+    <w:p>
+      <w:pPr>
+        <w:spacing w:after="100" w:before="0"/>
+      </w:pPr>
+      <w:r>
+        <w:rPr>
+          <w:rFonts w:ascii="Arial" w:cs="Arial" w:eastAsia="Arial" w:hAnsi="Arial"/>
+          <w:b w:val="false"/>
+          <w:bCs w:val="false"/>
+          <w:color w:val="374151"/>
+          <w:sz w:val="22"/>
+          <w:szCs w:val="22"/>
+        </w:rPr>
+        <w:t xml:space="preserve">Plain labels (no urn: prefix) skip namespace validation entirely. This allows simple label-based resolution without requiring a full URN, which is useful during development or in single-namespace deployments.</w:t>
+      </w:r>
+    </w:p>
     <w:p>
       <w:pPr>
         <w:spacing w:after="160" w:before="0"/>
@@ -3035,7 +3604,7 @@
           <w:sz w:val="28"/>
           <w:szCs w:val="28"/>
         </w:rPr>
-        <w:t xml:space="preserve">4.3  Resolution Flow — Cache Miss</w:t>
+        <w:t xml:space="preserve">4.3  Resolution Flow — Cache Hit</w:t>
       </w:r>
     </w:p>
     <w:p>
@@ -3051,7 +3620,7 @@
           <w:sz w:val="22"/>
           <w:szCs w:val="22"/>
         </w:rPr>
-        <w:t xml:space="preserve">Full resolution path — executed on first call or after TTL expiry. Example: two replicas registered (New York, London), requester in Paris:</w:t>
+        <w:t xml:space="preserve">The fast path. A repeated resolution within the TTL window returns a cached result in under 1 ms:</w:t>
       </w:r>
     </w:p>
     <w:p>
@@ -3106,329 +3675,161 @@
                 <w:sz w:val="18"/>
                 <w:szCs w:val="18"/>
               </w:rPr>
-              <w:t xml:space="preserve">Step 1   parse_urn()  →  label = 'emailer'</w:t>
-            </w:r>
-          </w:p>
-          <w:p>
-            <w:pPr>
-              <w:spacing w:after="0" w:before="0"/>
-            </w:pPr>
-            <w:r>
-              <w:rPr>
-                <w:rFonts w:ascii="Courier New" w:cs="Courier New" w:eastAsia="Courier New" w:hAnsi="Courier New"/>
-                <w:color w:val="1F2937"/>
-                <w:sz w:val="18"/>
-                <w:szCs w:val="18"/>
-              </w:rPr>
-              <w:t xml:space="preserve">Step 2   Cache miss — key not found or expired</w:t>
-            </w:r>
-          </w:p>
-          <w:p>
-            <w:pPr>
-              <w:spacing w:after="0" w:before="0"/>
-            </w:pPr>
-            <w:r>
-              <w:rPr>
-                <w:rFonts w:ascii="Courier New" w:cs="Courier New" w:eastAsia="Courier New" w:hAnsi="Courier New"/>
-                <w:color w:val="1F2937"/>
-                <w:sz w:val="18"/>
-                <w:szCs w:val="18"/>
-              </w:rPr>
-              <w:t xml:space="preserve">Step 3   Registry lookup: _registry['emailer']</w:t>
-            </w:r>
-          </w:p>
-          <w:p>
-            <w:pPr>
-              <w:spacing w:after="0" w:before="0"/>
-            </w:pPr>
-            <w:r>
-              <w:rPr>
-                <w:rFonts w:ascii="Courier New" w:cs="Courier New" w:eastAsia="Courier New" w:hAnsi="Courier New"/>
-                <w:color w:val="1F2937"/>
-                <w:sz w:val="18"/>
-                <w:szCs w:val="18"/>
-              </w:rPr>
-              <w:t xml:space="preserve">          → [nyc_entry, london_entry]  (HTTP 404 if unknown)</w:t>
-            </w:r>
-          </w:p>
-          <w:p>
-            <w:pPr>
-              <w:spacing w:after="0" w:before="0"/>
-            </w:pPr>
-            <w:r>
-              <w:rPr>
-                <w:rFonts w:ascii="Courier New" w:cs="Courier New" w:eastAsia="Courier New" w:hAnsi="Courier New"/>
-                <w:color w:val="1F2937"/>
-                <w:sz w:val="18"/>
-                <w:szCs w:val="18"/>
-              </w:rPr>
-              <w:t xml:space="preserve">Step 4   Build servers list with server_id, protocols, region, location</w:t>
-            </w:r>
-          </w:p>
-          <w:p>
-            <w:pPr>
-              <w:spacing w:after="0" w:before="0"/>
-            </w:pPr>
-            <w:r>
-              <w:rPr>
-                <w:rFonts w:ascii="Courier New" w:cs="Courier New" w:eastAsia="Courier New" w:hAnsi="Courier New"/>
-                <w:color w:val="1F2937"/>
-                <w:sz w:val="18"/>
-                <w:szCs w:val="18"/>
-              </w:rPr>
-              <w:t xml:space="preserve">Step 5   Read health from _health_cache</w:t>
-            </w:r>
-          </w:p>
-          <w:p>
-            <w:pPr>
-              <w:spacing w:after="0" w:before="0"/>
-            </w:pPr>
-            <w:r>
-              <w:rPr>
-                <w:rFonts w:ascii="Courier New" w:cs="Courier New" w:eastAsia="Courier New" w:hAnsi="Courier New"/>
-                <w:color w:val="1F2937"/>
-                <w:sz w:val="18"/>
-                <w:szCs w:val="18"/>
-              </w:rPr>
-              <w:t xml:space="preserve">          health_map = {</w:t>
-            </w:r>
-          </w:p>
-          <w:p>
-            <w:pPr>
-              <w:spacing w:after="0" w:before="0"/>
-            </w:pPr>
-            <w:r>
-              <w:rPr>
-                <w:rFonts w:ascii="Courier New" w:cs="Courier New" w:eastAsia="Courier New" w:hAnsi="Courier New"/>
-                <w:color w:val="1F2937"/>
-                <w:sz w:val="18"/>
-                <w:szCs w:val="18"/>
-              </w:rPr>
-              <w:t xml:space="preserve">            'http://ny-host:9001': {status:'healthy', latency:45ms},</w:t>
-            </w:r>
-          </w:p>
-          <w:p>
-            <w:pPr>
-              <w:spacing w:after="0" w:before="0"/>
-            </w:pPr>
-            <w:r>
-              <w:rPr>
-                <w:rFonts w:ascii="Courier New" w:cs="Courier New" w:eastAsia="Courier New" w:hAnsi="Courier New"/>
-                <w:color w:val="1F2937"/>
-                <w:sz w:val="18"/>
-                <w:szCs w:val="18"/>
-              </w:rPr>
-              <w:t xml:space="preserve">            'http://lon-host:9001': {status:'healthy', latency:210ms}</w:t>
-            </w:r>
-          </w:p>
-          <w:p>
-            <w:pPr>
-              <w:spacing w:after="0" w:before="0"/>
-            </w:pPr>
-            <w:r>
-              <w:rPr>
-                <w:rFonts w:ascii="Courier New" w:cs="Courier New" w:eastAsia="Courier New" w:hAnsi="Courier New"/>
-                <w:color w:val="1F2937"/>
-                <w:sz w:val="18"/>
-                <w:szCs w:val="18"/>
-              </w:rPr>
-              <w:t xml:space="preserve">          }</w:t>
-            </w:r>
-          </w:p>
-          <w:p>
-            <w:pPr>
-              <w:spacing w:after="0" w:before="0"/>
-            </w:pPr>
-            <w:r>
-              <w:rPr>
-                <w:rFonts w:ascii="Courier New" w:cs="Courier New" w:eastAsia="Courier New" w:hAnsi="Courier New"/>
-                <w:color w:val="1F2937"/>
-                <w:sz w:val="18"/>
-                <w:szCs w:val="18"/>
-              </w:rPr>
-              <w:t xml:space="preserve">Step 6   Live-check any 'unknown' endpoints (parallel asyncio.gather)</w:t>
-            </w:r>
-          </w:p>
-          <w:p>
-            <w:pPr>
-              <w:spacing w:after="0" w:before="0"/>
-            </w:pPr>
-            <w:r>
-              <w:rPr>
-                <w:rFonts w:ascii="Courier New" w:cs="Courier New" w:eastAsia="Courier New" w:hAnsi="Courier New"/>
-                <w:color w:val="1F2937"/>
-                <w:sz w:val="18"/>
-                <w:szCs w:val="18"/>
-              </w:rPr>
-              <w:t xml:space="preserve">Step 7   rank_servers(servers, health_map, requester_context)</w:t>
-            </w:r>
-          </w:p>
-          <w:p>
-            <w:pPr>
-              <w:spacing w:after="0" w:before="0"/>
-            </w:pPr>
-            <w:r>
-              <w:rPr>
-                <w:rFonts w:ascii="Courier New" w:cs="Courier New" w:eastAsia="Courier New" w:hAnsi="Courier New"/>
-                <w:color w:val="1F2937"/>
-                <w:sz w:val="18"/>
-                <w:szCs w:val="18"/>
-              </w:rPr>
-              <w:t xml:space="preserve">          Requester: Paris  48.8566°N  2.3522°E</w:t>
-            </w:r>
-          </w:p>
-          <w:p>
-            <w:pPr>
-              <w:spacing w:after="0" w:before="0"/>
-            </w:pPr>
-            <w:r>
-              <w:rPr>
-                <w:rFonts w:ascii="Courier New" w:cs="Courier New" w:eastAsia="Courier New" w:hAnsi="Courier New"/>
-                <w:color w:val="1F2937"/>
-                <w:sz w:val="18"/>
-                <w:szCs w:val="18"/>
-              </w:rPr>
-              <w:t xml:space="preserve">          NYC:    haversine(Paris, NYC)    = 5,837 km</w:t>
-            </w:r>
-          </w:p>
-          <w:p>
-            <w:pPr>
-              <w:spacing w:after="0" w:before="0"/>
-            </w:pPr>
-            <w:r>
-              <w:rPr>
-                <w:rFonts w:ascii="Courier New" w:cs="Courier New" w:eastAsia="Courier New" w:hAnsi="Courier New"/>
-                <w:color w:val="1F2937"/>
-                <w:sz w:val="18"/>
-                <w:szCs w:val="18"/>
-              </w:rPr>
-              <w:t xml:space="preserve">          London: haversine(Paris, London) =   341 km</w:t>
-            </w:r>
-          </w:p>
-          <w:p>
-            <w:pPr>
-              <w:spacing w:after="0" w:before="0"/>
-            </w:pPr>
-            <w:r>
-              <w:rPr>
-                <w:rFonts w:ascii="Courier New" w:cs="Courier New" w:eastAsia="Courier New" w:hAnsi="Courier New"/>
-                <w:color w:val="1F2937"/>
-                <w:sz w:val="18"/>
-                <w:szCs w:val="18"/>
-              </w:rPr>
-              <w:t xml:space="preserve">          Sort keys:</w:t>
-            </w:r>
-          </w:p>
-          <w:p>
-            <w:pPr>
-              <w:spacing w:after="0" w:before="0"/>
-            </w:pPr>
-            <w:r>
-              <w:rPr>
-                <w:rFonts w:ascii="Courier New" w:cs="Courier New" w:eastAsia="Courier New" w:hAnsi="Courier New"/>
-                <w:color w:val="1F2937"/>
-                <w:sz w:val="18"/>
-                <w:szCs w:val="18"/>
-              </w:rPr>
-              <w:t xml:space="preserve">            NYC:    (0, 0, 5837, 45.0,  30.0)</w:t>
-            </w:r>
-          </w:p>
-          <w:p>
-            <w:pPr>
-              <w:spacing w:after="0" w:before="0"/>
-            </w:pPr>
-            <w:r>
-              <w:rPr>
-                <w:rFonts w:ascii="Courier New" w:cs="Courier New" w:eastAsia="Courier New" w:hAnsi="Courier New"/>
-                <w:color w:val="1F2937"/>
-                <w:sz w:val="18"/>
-                <w:szCs w:val="18"/>
-              </w:rPr>
-              <w:t xml:space="preserve">            London: (0, 0,  341, 210.0, 20.0)</w:t>
-            </w:r>
-          </w:p>
-          <w:p>
-            <w:pPr>
-              <w:spacing w:after="0" w:before="0"/>
-            </w:pPr>
-            <w:r>
-              <w:rPr>
-                <w:rFonts w:ascii="Courier New" w:cs="Courier New" w:eastAsia="Courier New" w:hAnsi="Courier New"/>
-                <w:color w:val="1F2937"/>
-                <w:sz w:val="18"/>
-                <w:szCs w:val="18"/>
-              </w:rPr>
-              <w:t xml:space="preserve">          → London wins at position 3 (geo distance 341 &lt; 5837)</w:t>
-            </w:r>
-          </w:p>
-          <w:p>
-            <w:pPr>
-              <w:spacing w:after="0" w:before="0"/>
-            </w:pPr>
-            <w:r>
-              <w:rPr>
-                <w:rFonts w:ascii="Courier New" w:cs="Courier New" w:eastAsia="Courier New" w:hAnsi="Courier New"/>
-                <w:color w:val="1F2937"/>
-                <w:sz w:val="18"/>
-                <w:szCs w:val="18"/>
-              </w:rPr>
-              <w:t xml:space="preserve">Step 8   selected_by = 'geo_nearest' (location provided + multiple candidates)</w:t>
-            </w:r>
-          </w:p>
-          <w:p>
-            <w:pPr>
-              <w:spacing w:after="0" w:before="0"/>
-            </w:pPr>
-            <w:r>
-              <w:rPr>
-                <w:rFonts w:ascii="Courier New" w:cs="Courier New" w:eastAsia="Courier New" w:hAnsi="Courier New"/>
-                <w:color w:val="1F2937"/>
-                <w:sz w:val="18"/>
-                <w:szCs w:val="18"/>
-              </w:rPr>
-              <w:t xml:space="preserve">Step 9   select_protocol(['http','A2A'], ['A2A'])  →  'A2A'</w:t>
-            </w:r>
-          </w:p>
-          <w:p>
-            <w:pPr>
-              <w:spacing w:after="0" w:before="0"/>
-            </w:pPr>
-            <w:r>
-              <w:rPr>
-                <w:rFonts w:ascii="Courier New" w:cs="Courier New" w:eastAsia="Courier New" w:hAnsi="Courier New"/>
-                <w:color w:val="1F2937"/>
-                <w:sz w:val="18"/>
-                <w:szCs w:val="18"/>
-              </w:rPr>
-              <w:t xml:space="preserve">Step 10  calculate_ttl({status:'healthy'})  →  60 seconds</w:t>
-            </w:r>
-          </w:p>
-          <w:p>
-            <w:pPr>
-              <w:spacing w:after="0" w:before="0"/>
-            </w:pPr>
-            <w:r>
-              <w:rPr>
-                <w:rFonts w:ascii="Courier New" w:cs="Courier New" w:eastAsia="Courier New" w:hAnsi="Courier New"/>
-                <w:color w:val="1F2937"/>
-                <w:sz w:val="18"/>
-                <w:szCs w:val="18"/>
-              </w:rPr>
-              <w:t xml:space="preserve">Step 11  _cache.set(key, result, ttl=60)</w:t>
-            </w:r>
-          </w:p>
-          <w:p>
-            <w:pPr>
-              <w:spacing w:after="0" w:before="0"/>
-            </w:pPr>
-            <w:r>
-              <w:rPr>
-                <w:rFonts w:ascii="Courier New" w:cs="Courier New" w:eastAsia="Courier New" w:hAnsi="Courier New"/>
-                <w:color w:val="1F2937"/>
-                <w:sz w:val="18"/>
-                <w:szCs w:val="18"/>
-              </w:rPr>
-              <w:t xml:space="preserve">Step 12  Return full result</w:t>
+              <w:t xml:space="preserve">POST /resolve  { 'agent_name': 'urn:...:emailer', 'requester_context': {...} }</w:t>
+            </w:r>
+          </w:p>
+          <w:p>
+            <w:pPr>
+              <w:spacing w:after="0" w:before="0"/>
+            </w:pPr>
+            <w:r>
+              <w:rPr>
+                <w:rFonts w:ascii="Courier New" w:cs="Courier New" w:eastAsia="Courier New" w:hAnsi="Courier New"/>
+                <w:color w:val="1F2937"/>
+                <w:sz w:val="18"/>
+                <w:szCs w:val="18"/>
+              </w:rPr>
+              <w:t xml:space="preserve"> </w:t>
+            </w:r>
+          </w:p>
+          <w:p>
+            <w:pPr>
+              <w:spacing w:after="0" w:before="0"/>
+            </w:pPr>
+            <w:r>
+              <w:rPr>
+                <w:rFonts w:ascii="Courier New" w:cs="Courier New" w:eastAsia="Courier New" w:hAnsi="Courier New"/>
+                <w:color w:val="1F2937"/>
+                <w:sz w:val="18"/>
+                <w:szCs w:val="18"/>
+              </w:rPr>
+              <w:t xml:space="preserve">Step 1  parse_urn()  →  label = 'emailer'</w:t>
+            </w:r>
+          </w:p>
+          <w:p>
+            <w:pPr>
+              <w:spacing w:after="0" w:before="0"/>
+            </w:pPr>
+            <w:r>
+              <w:rPr>
+                <w:rFonts w:ascii="Courier New" w:cs="Courier New" w:eastAsia="Courier New" w:hAnsi="Courier New"/>
+                <w:color w:val="1F2937"/>
+                <w:sz w:val="18"/>
+                <w:szCs w:val="18"/>
+              </w:rPr>
+              <w:t xml:space="preserve">Step 2  Build cache key: MD5(label | sorted_protocols | location_json)</w:t>
+            </w:r>
+          </w:p>
+          <w:p>
+            <w:pPr>
+              <w:spacing w:after="0" w:before="0"/>
+            </w:pPr>
+            <w:r>
+              <w:rPr>
+                <w:rFonts w:ascii="Courier New" w:cs="Courier New" w:eastAsia="Courier New" w:hAnsi="Courier New"/>
+                <w:color w:val="1F2937"/>
+                <w:sz w:val="18"/>
+                <w:szCs w:val="18"/>
+              </w:rPr>
+              <w:t xml:space="preserve">         → deterministic hex digest, e.g. 'a3f2c1d8...'</w:t>
+            </w:r>
+          </w:p>
+          <w:p>
+            <w:pPr>
+              <w:spacing w:after="0" w:before="0"/>
+            </w:pPr>
+            <w:r>
+              <w:rPr>
+                <w:rFonts w:ascii="Courier New" w:cs="Courier New" w:eastAsia="Courier New" w:hAnsi="Courier New"/>
+                <w:color w:val="1F2937"/>
+                <w:sz w:val="18"/>
+                <w:szCs w:val="18"/>
+              </w:rPr>
+              <w:t xml:space="preserve">Step 3  _cache.get(key)</w:t>
+            </w:r>
+          </w:p>
+          <w:p>
+            <w:pPr>
+              <w:spacing w:after="0" w:before="0"/>
+            </w:pPr>
+            <w:r>
+              <w:rPr>
+                <w:rFonts w:ascii="Courier New" w:cs="Courier New" w:eastAsia="Courier New" w:hAnsi="Courier New"/>
+                <w:color w:val="1F2937"/>
+                <w:sz w:val="18"/>
+                <w:szCs w:val="18"/>
+              </w:rPr>
+              <w:t xml:space="preserve">         Entry found AND monotonic() &lt; expiry → cache HIT</w:t>
+            </w:r>
+          </w:p>
+          <w:p>
+            <w:pPr>
+              <w:spacing w:after="0" w:before="0"/>
+            </w:pPr>
+            <w:r>
+              <w:rPr>
+                <w:rFonts w:ascii="Courier New" w:cs="Courier New" w:eastAsia="Courier New" w:hAnsi="Courier New"/>
+                <w:color w:val="1F2937"/>
+                <w:sz w:val="18"/>
+                <w:szCs w:val="18"/>
+              </w:rPr>
+              <w:t xml:space="preserve">         Increment hits counter</w:t>
+            </w:r>
+          </w:p>
+          <w:p>
+            <w:pPr>
+              <w:spacing w:after="0" w:before="0"/>
+            </w:pPr>
+            <w:r>
+              <w:rPr>
+                <w:rFonts w:ascii="Courier New" w:cs="Courier New" w:eastAsia="Courier New" w:hAnsi="Courier New"/>
+                <w:color w:val="1F2937"/>
+                <w:sz w:val="18"/>
+                <w:szCs w:val="18"/>
+              </w:rPr>
+              <w:t xml:space="preserve">Step 4  Inject resolution_time_ms, set cached=True</w:t>
+            </w:r>
+          </w:p>
+          <w:p>
+            <w:pPr>
+              <w:spacing w:after="0" w:before="0"/>
+            </w:pPr>
+            <w:r>
+              <w:rPr>
+                <w:rFonts w:ascii="Courier New" w:cs="Courier New" w:eastAsia="Courier New" w:hAnsi="Courier New"/>
+                <w:color w:val="1F2937"/>
+                <w:sz w:val="18"/>
+                <w:szCs w:val="18"/>
+              </w:rPr>
+              <w:t xml:space="preserve">Step 5  Return immediately</w:t>
+            </w:r>
+          </w:p>
+          <w:p>
+            <w:pPr>
+              <w:spacing w:after="0" w:before="0"/>
+            </w:pPr>
+            <w:r>
+              <w:rPr>
+                <w:rFonts w:ascii="Courier New" w:cs="Courier New" w:eastAsia="Courier New" w:hAnsi="Courier New"/>
+                <w:color w:val="1F2937"/>
+                <w:sz w:val="18"/>
+                <w:szCs w:val="18"/>
+              </w:rPr>
+              <w:t xml:space="preserve"> </w:t>
+            </w:r>
+          </w:p>
+          <w:p>
+            <w:pPr>
+              <w:spacing w:after="0" w:before="0"/>
+            </w:pPr>
+            <w:r>
+              <w:rPr>
+                <w:rFonts w:ascii="Courier New" w:cs="Courier New" w:eastAsia="Courier New" w:hAnsi="Courier New"/>
+                <w:color w:val="1F2937"/>
+                <w:sz w:val="18"/>
+                <w:szCs w:val="18"/>
+              </w:rPr>
+              <w:t xml:space="preserve">Typical round-trip: &lt; 1 ms (in-process dict lookup + MD5)</w:t>
             </w:r>
           </w:p>
         </w:tc>
@@ -3456,7 +3857,428 @@
           <w:sz w:val="28"/>
           <w:szCs w:val="28"/>
         </w:rPr>
-        <w:t xml:space="preserve">4.4  Background Health Sweep</w:t>
+        <w:t xml:space="preserve">4.4  Resolution Flow — Cache Miss</w:t>
+      </w:r>
+    </w:p>
+    <w:p>
+      <w:pPr>
+        <w:spacing w:after="100" w:before="0"/>
+      </w:pPr>
+      <w:r>
+        <w:rPr>
+          <w:rFonts w:ascii="Arial" w:cs="Arial" w:eastAsia="Arial" w:hAnsi="Arial"/>
+          <w:b w:val="false"/>
+          <w:bCs w:val="false"/>
+          <w:color w:val="374151"/>
+          <w:sz w:val="22"/>
+          <w:szCs w:val="22"/>
+        </w:rPr>
+        <w:t xml:space="preserve">Full resolution path — executed on first call or after TTL expiry. Example: two replicas registered (New York, London), requester in Paris:</w:t>
+      </w:r>
+    </w:p>
+    <w:p>
+      <w:pPr>
+        <w:spacing w:after="80" w:before="0"/>
+      </w:pPr>
+      <w:r>
+        <w:t xml:space="preserve"/>
+      </w:r>
+    </w:p>
+    <w:tbl>
+      <w:tblPr>
+        <w:tblW w:type="dxa" w:w="9360"/>
+        <w:tblBorders>
+          <w:top w:val="single" w:color="auto" w:sz="4"/>
+          <w:left w:val="single" w:color="auto" w:sz="4"/>
+          <w:bottom w:val="single" w:color="auto" w:sz="4"/>
+          <w:right w:val="single" w:color="auto" w:sz="4"/>
+          <w:insideH w:val="single" w:color="auto" w:sz="4"/>
+          <w:insideV w:val="single" w:color="auto" w:sz="4"/>
+        </w:tblBorders>
+      </w:tblPr>
+      <w:tblGrid>
+        <w:gridCol w:w="9360"/>
+      </w:tblGrid>
+      <w:tr>
+        <w:tc>
+          <w:tcPr>
+            <w:tcW w:type="dxa" w:w="9360"/>
+            <w:tcBorders>
+              <w:top w:val="single" w:color="D1D5DB" w:sz="1"/>
+              <w:left w:val="single" w:color="D1D5DB" w:sz="1"/>
+              <w:bottom w:val="single" w:color="D1D5DB" w:sz="1"/>
+              <w:right w:val="single" w:color="D1D5DB" w:sz="1"/>
+            </w:tcBorders>
+            <w:shd w:fill="F3F4F6" w:val="clear"/>
+            <w:tcMar>
+              <w:top w:type="dxa" w:w="120"/>
+              <w:left w:type="dxa" w:w="200"/>
+              <w:bottom w:type="dxa" w:w="120"/>
+              <w:right w:type="dxa" w:w="200"/>
+            </w:tcMar>
+          </w:tcPr>
+          <w:p>
+            <w:pPr>
+              <w:spacing w:after="0" w:before="0"/>
+            </w:pPr>
+            <w:r>
+              <w:rPr>
+                <w:rFonts w:ascii="Courier New" w:cs="Courier New" w:eastAsia="Courier New" w:hAnsi="Courier New"/>
+                <w:color w:val="1F2937"/>
+                <w:sz w:val="18"/>
+                <w:szCs w:val="18"/>
+              </w:rPr>
+              <w:t xml:space="preserve">Step 1   parse_urn()  →  label = 'emailer'</w:t>
+            </w:r>
+          </w:p>
+          <w:p>
+            <w:pPr>
+              <w:spacing w:after="0" w:before="0"/>
+            </w:pPr>
+            <w:r>
+              <w:rPr>
+                <w:rFonts w:ascii="Courier New" w:cs="Courier New" w:eastAsia="Courier New" w:hAnsi="Courier New"/>
+                <w:color w:val="1F2937"/>
+                <w:sz w:val="18"/>
+                <w:szCs w:val="18"/>
+              </w:rPr>
+              <w:t xml:space="preserve">Step 2   Cache miss — key not found or expired</w:t>
+            </w:r>
+          </w:p>
+          <w:p>
+            <w:pPr>
+              <w:spacing w:after="0" w:before="0"/>
+            </w:pPr>
+            <w:r>
+              <w:rPr>
+                <w:rFonts w:ascii="Courier New" w:cs="Courier New" w:eastAsia="Courier New" w:hAnsi="Courier New"/>
+                <w:color w:val="1F2937"/>
+                <w:sz w:val="18"/>
+                <w:szCs w:val="18"/>
+              </w:rPr>
+              <w:t xml:space="preserve">Step 3   Registry lookup: _registry['emailer']</w:t>
+            </w:r>
+          </w:p>
+          <w:p>
+            <w:pPr>
+              <w:spacing w:after="0" w:before="0"/>
+            </w:pPr>
+            <w:r>
+              <w:rPr>
+                <w:rFonts w:ascii="Courier New" w:cs="Courier New" w:eastAsia="Courier New" w:hAnsi="Courier New"/>
+                <w:color w:val="1F2937"/>
+                <w:sz w:val="18"/>
+                <w:szCs w:val="18"/>
+              </w:rPr>
+              <w:t xml:space="preserve">          → [nyc_entry, london_entry]  (HTTP 404 if unknown)</w:t>
+            </w:r>
+          </w:p>
+          <w:p>
+            <w:pPr>
+              <w:spacing w:after="0" w:before="0"/>
+            </w:pPr>
+            <w:r>
+              <w:rPr>
+                <w:rFonts w:ascii="Courier New" w:cs="Courier New" w:eastAsia="Courier New" w:hAnsi="Courier New"/>
+                <w:color w:val="1F2937"/>
+                <w:sz w:val="18"/>
+                <w:szCs w:val="18"/>
+              </w:rPr>
+              <w:t xml:space="preserve">Step 4   Build servers list with server_id, protocols, region, location</w:t>
+            </w:r>
+          </w:p>
+          <w:p>
+            <w:pPr>
+              <w:spacing w:after="0" w:before="0"/>
+            </w:pPr>
+            <w:r>
+              <w:rPr>
+                <w:rFonts w:ascii="Courier New" w:cs="Courier New" w:eastAsia="Courier New" w:hAnsi="Courier New"/>
+                <w:color w:val="1F2937"/>
+                <w:sz w:val="18"/>
+                <w:szCs w:val="18"/>
+              </w:rPr>
+              <w:t xml:space="preserve">Step 5   Read health from _health_cache</w:t>
+            </w:r>
+          </w:p>
+          <w:p>
+            <w:pPr>
+              <w:spacing w:after="0" w:before="0"/>
+            </w:pPr>
+            <w:r>
+              <w:rPr>
+                <w:rFonts w:ascii="Courier New" w:cs="Courier New" w:eastAsia="Courier New" w:hAnsi="Courier New"/>
+                <w:color w:val="1F2937"/>
+                <w:sz w:val="18"/>
+                <w:szCs w:val="18"/>
+              </w:rPr>
+              <w:t xml:space="preserve">          health_map = {</w:t>
+            </w:r>
+          </w:p>
+          <w:p>
+            <w:pPr>
+              <w:spacing w:after="0" w:before="0"/>
+            </w:pPr>
+            <w:r>
+              <w:rPr>
+                <w:rFonts w:ascii="Courier New" w:cs="Courier New" w:eastAsia="Courier New" w:hAnsi="Courier New"/>
+                <w:color w:val="1F2937"/>
+                <w:sz w:val="18"/>
+                <w:szCs w:val="18"/>
+              </w:rPr>
+              <w:t xml:space="preserve">            'http://ny-host:9001': {status:'healthy', latency:45ms},</w:t>
+            </w:r>
+          </w:p>
+          <w:p>
+            <w:pPr>
+              <w:spacing w:after="0" w:before="0"/>
+            </w:pPr>
+            <w:r>
+              <w:rPr>
+                <w:rFonts w:ascii="Courier New" w:cs="Courier New" w:eastAsia="Courier New" w:hAnsi="Courier New"/>
+                <w:color w:val="1F2937"/>
+                <w:sz w:val="18"/>
+                <w:szCs w:val="18"/>
+              </w:rPr>
+              <w:t xml:space="preserve">            'http://lon-host:9001': {status:'healthy', latency:210ms}</w:t>
+            </w:r>
+          </w:p>
+          <w:p>
+            <w:pPr>
+              <w:spacing w:after="0" w:before="0"/>
+            </w:pPr>
+            <w:r>
+              <w:rPr>
+                <w:rFonts w:ascii="Courier New" w:cs="Courier New" w:eastAsia="Courier New" w:hAnsi="Courier New"/>
+                <w:color w:val="1F2937"/>
+                <w:sz w:val="18"/>
+                <w:szCs w:val="18"/>
+              </w:rPr>
+              <w:t xml:space="preserve">          }</w:t>
+            </w:r>
+          </w:p>
+          <w:p>
+            <w:pPr>
+              <w:spacing w:after="0" w:before="0"/>
+            </w:pPr>
+            <w:r>
+              <w:rPr>
+                <w:rFonts w:ascii="Courier New" w:cs="Courier New" w:eastAsia="Courier New" w:hAnsi="Courier New"/>
+                <w:color w:val="1F2937"/>
+                <w:sz w:val="18"/>
+                <w:szCs w:val="18"/>
+              </w:rPr>
+              <w:t xml:space="preserve">Step 6   Live-check any 'unknown' endpoints (parallel asyncio.gather)</w:t>
+            </w:r>
+          </w:p>
+          <w:p>
+            <w:pPr>
+              <w:spacing w:after="0" w:before="0"/>
+            </w:pPr>
+            <w:r>
+              <w:rPr>
+                <w:rFonts w:ascii="Courier New" w:cs="Courier New" w:eastAsia="Courier New" w:hAnsi="Courier New"/>
+                <w:color w:val="1F2937"/>
+                <w:sz w:val="18"/>
+                <w:szCs w:val="18"/>
+              </w:rPr>
+              <w:t xml:space="preserve">Step 7   rank_servers(servers, health_map, requester_context)</w:t>
+            </w:r>
+          </w:p>
+          <w:p>
+            <w:pPr>
+              <w:spacing w:after="0" w:before="0"/>
+            </w:pPr>
+            <w:r>
+              <w:rPr>
+                <w:rFonts w:ascii="Courier New" w:cs="Courier New" w:eastAsia="Courier New" w:hAnsi="Courier New"/>
+                <w:color w:val="1F2937"/>
+                <w:sz w:val="18"/>
+                <w:szCs w:val="18"/>
+              </w:rPr>
+              <w:t xml:space="preserve">          Requester: Paris  48.8566°N  2.3522°E</w:t>
+            </w:r>
+          </w:p>
+          <w:p>
+            <w:pPr>
+              <w:spacing w:after="0" w:before="0"/>
+            </w:pPr>
+            <w:r>
+              <w:rPr>
+                <w:rFonts w:ascii="Courier New" w:cs="Courier New" w:eastAsia="Courier New" w:hAnsi="Courier New"/>
+                <w:color w:val="1F2937"/>
+                <w:sz w:val="18"/>
+                <w:szCs w:val="18"/>
+              </w:rPr>
+              <w:t xml:space="preserve">          NYC:    haversine(Paris, NYC)    = 5,837 km</w:t>
+            </w:r>
+          </w:p>
+          <w:p>
+            <w:pPr>
+              <w:spacing w:after="0" w:before="0"/>
+            </w:pPr>
+            <w:r>
+              <w:rPr>
+                <w:rFonts w:ascii="Courier New" w:cs="Courier New" w:eastAsia="Courier New" w:hAnsi="Courier New"/>
+                <w:color w:val="1F2937"/>
+                <w:sz w:val="18"/>
+                <w:szCs w:val="18"/>
+              </w:rPr>
+              <w:t xml:space="preserve">          London: haversine(Paris, London) =   341 km</w:t>
+            </w:r>
+          </w:p>
+          <w:p>
+            <w:pPr>
+              <w:spacing w:after="0" w:before="0"/>
+            </w:pPr>
+            <w:r>
+              <w:rPr>
+                <w:rFonts w:ascii="Courier New" w:cs="Courier New" w:eastAsia="Courier New" w:hAnsi="Courier New"/>
+                <w:color w:val="1F2937"/>
+                <w:sz w:val="18"/>
+                <w:szCs w:val="18"/>
+              </w:rPr>
+              <w:t xml:space="preserve">          Sort keys:</w:t>
+            </w:r>
+          </w:p>
+          <w:p>
+            <w:pPr>
+              <w:spacing w:after="0" w:before="0"/>
+            </w:pPr>
+            <w:r>
+              <w:rPr>
+                <w:rFonts w:ascii="Courier New" w:cs="Courier New" w:eastAsia="Courier New" w:hAnsi="Courier New"/>
+                <w:color w:val="1F2937"/>
+                <w:sz w:val="18"/>
+                <w:szCs w:val="18"/>
+              </w:rPr>
+              <w:t xml:space="preserve">            NYC:    (0, 0, 5837, 45.0,  30.0)</w:t>
+            </w:r>
+          </w:p>
+          <w:p>
+            <w:pPr>
+              <w:spacing w:after="0" w:before="0"/>
+            </w:pPr>
+            <w:r>
+              <w:rPr>
+                <w:rFonts w:ascii="Courier New" w:cs="Courier New" w:eastAsia="Courier New" w:hAnsi="Courier New"/>
+                <w:color w:val="1F2937"/>
+                <w:sz w:val="18"/>
+                <w:szCs w:val="18"/>
+              </w:rPr>
+              <w:t xml:space="preserve">            London: (0, 0,  341, 210.0, 20.0)</w:t>
+            </w:r>
+          </w:p>
+          <w:p>
+            <w:pPr>
+              <w:spacing w:after="0" w:before="0"/>
+            </w:pPr>
+            <w:r>
+              <w:rPr>
+                <w:rFonts w:ascii="Courier New" w:cs="Courier New" w:eastAsia="Courier New" w:hAnsi="Courier New"/>
+                <w:color w:val="1F2937"/>
+                <w:sz w:val="18"/>
+                <w:szCs w:val="18"/>
+              </w:rPr>
+              <w:t xml:space="preserve">          → London wins at position 3 (geo distance 341 &lt; 5837)</w:t>
+            </w:r>
+          </w:p>
+          <w:p>
+            <w:pPr>
+              <w:spacing w:after="0" w:before="0"/>
+            </w:pPr>
+            <w:r>
+              <w:rPr>
+                <w:rFonts w:ascii="Courier New" w:cs="Courier New" w:eastAsia="Courier New" w:hAnsi="Courier New"/>
+                <w:color w:val="1F2937"/>
+                <w:sz w:val="18"/>
+                <w:szCs w:val="18"/>
+              </w:rPr>
+              <w:t xml:space="preserve">Step 8   selected_by = 'geo_nearest' (location provided + multiple candidates)</w:t>
+            </w:r>
+          </w:p>
+          <w:p>
+            <w:pPr>
+              <w:spacing w:after="0" w:before="0"/>
+            </w:pPr>
+            <w:r>
+              <w:rPr>
+                <w:rFonts w:ascii="Courier New" w:cs="Courier New" w:eastAsia="Courier New" w:hAnsi="Courier New"/>
+                <w:color w:val="1F2937"/>
+                <w:sz w:val="18"/>
+                <w:szCs w:val="18"/>
+              </w:rPr>
+              <w:t xml:space="preserve">Step 9   select_protocol(['http','A2A'], ['A2A'])  →  'A2A'</w:t>
+            </w:r>
+          </w:p>
+          <w:p>
+            <w:pPr>
+              <w:spacing w:after="0" w:before="0"/>
+            </w:pPr>
+            <w:r>
+              <w:rPr>
+                <w:rFonts w:ascii="Courier New" w:cs="Courier New" w:eastAsia="Courier New" w:hAnsi="Courier New"/>
+                <w:color w:val="1F2937"/>
+                <w:sz w:val="18"/>
+                <w:szCs w:val="18"/>
+              </w:rPr>
+              <w:t xml:space="preserve">Step 10  calculate_ttl({status:'healthy'})  →  60 seconds</w:t>
+            </w:r>
+          </w:p>
+          <w:p>
+            <w:pPr>
+              <w:spacing w:after="0" w:before="0"/>
+            </w:pPr>
+            <w:r>
+              <w:rPr>
+                <w:rFonts w:ascii="Courier New" w:cs="Courier New" w:eastAsia="Courier New" w:hAnsi="Courier New"/>
+                <w:color w:val="1F2937"/>
+                <w:sz w:val="18"/>
+                <w:szCs w:val="18"/>
+              </w:rPr>
+              <w:t xml:space="preserve">Step 11  _cache.set(key, result, ttl=60)</w:t>
+            </w:r>
+          </w:p>
+          <w:p>
+            <w:pPr>
+              <w:spacing w:after="0" w:before="0"/>
+            </w:pPr>
+            <w:r>
+              <w:rPr>
+                <w:rFonts w:ascii="Courier New" w:cs="Courier New" w:eastAsia="Courier New" w:hAnsi="Courier New"/>
+                <w:color w:val="1F2937"/>
+                <w:sz w:val="18"/>
+                <w:szCs w:val="18"/>
+              </w:rPr>
+              <w:t xml:space="preserve">Step 12  Return full result</w:t>
+            </w:r>
+          </w:p>
+        </w:tc>
+      </w:tr>
+    </w:tbl>
+    <w:p>
+      <w:pPr>
+        <w:spacing w:after="160" w:before="0"/>
+      </w:pPr>
+      <w:r>
+        <w:t xml:space="preserve"/>
+      </w:r>
+    </w:p>
+    <w:p>
+      <w:pPr>
+        <w:pStyle w:val="Heading2"/>
+        <w:spacing w:after="120" w:before="320"/>
+      </w:pPr>
+      <w:r>
+        <w:rPr>
+          <w:rFonts w:ascii="Arial" w:cs="Arial" w:eastAsia="Arial" w:hAnsi="Arial"/>
+          <w:b/>
+          <w:bCs/>
+          <w:color w:val="0E6B8A"/>
+          <w:sz w:val="28"/>
+          <w:szCs w:val="28"/>
+        </w:rPr>
+        <w:t xml:space="preserve">4.5  Background Health Sweep</w:t>
       </w:r>
     </w:p>
     <w:p>
@@ -8282,7 +9104,7 @@
           <w:sz w:val="22"/>
           <w:szCs w:val="22"/>
         </w:rPr>
-        <w:t xml:space="preserve">A dict mapping 60+ lowercase city name strings to (latitude, longitude) tuples. Covers North America, Europe, Asia-Pacific, and South America. Used in two places:</w:t>
+        <w:t xml:space="preserve">A dict mapping 120+ lowercase city name strings to (latitude, longitude) tuples. Covers North America (including NJ datacenter cities: Newark, Parsippany, Secaucus), Europe, Asia-Pacific (India: Bangalore, Hyderabad, Chennai, Pune, Kolkata), Africa, and South America. Used in two places:</w:t>
       </w:r>
     </w:p>
     <w:p>
@@ -13129,6 +13951,1707 @@
     </w:p>
     <w:p>
       <w:pPr>
+        <w:pStyle w:val="Heading2"/>
+        <w:spacing w:after="120" w:before="320"/>
+      </w:pPr>
+      <w:r>
+        <w:rPr>
+          <w:rFonts w:ascii="Arial" w:cs="Arial" w:eastAsia="Arial" w:hAnsi="Arial"/>
+          <w:b/>
+          <w:bCs/>
+          <w:color w:val="0E6B8A"/>
+          <w:sz w:val="28"/>
+          <w:szCs w:val="28"/>
+        </w:rPr>
+        <w:t xml:space="preserve">5.7  geocoder.py — Automatic City Geocoding</w:t>
+      </w:r>
+    </w:p>
+    <w:p>
+      <w:pPr>
+        <w:spacing w:after="100" w:before="0"/>
+      </w:pPr>
+      <w:r>
+        <w:rPr>
+          <w:rFonts w:ascii="Arial" w:cs="Arial" w:eastAsia="Arial" w:hAnsi="Arial"/>
+          <w:b w:val="false"/>
+          <w:bCs w:val="false"/>
+          <w:color w:val="374151"/>
+          <w:sz w:val="22"/>
+          <w:szCs w:val="22"/>
+        </w:rPr>
+        <w:t xml:space="preserve">Resolves any city name to (latitude, longitude) coordinates so agents can register with only a city name and still participate in geo-routing. No API key required. Falls back gracefully — if geocoding fails, the endpoint is still registered, geo-routing is simply disabled for it.</w:t>
+      </w:r>
+    </w:p>
+    <w:p>
+      <w:pPr>
+        <w:spacing w:after="120" w:before="0"/>
+      </w:pPr>
+      <w:r>
+        <w:t xml:space="preserve"/>
+      </w:r>
+    </w:p>
+    <w:p>
+      <w:pPr>
+        <w:pStyle w:val="Heading3"/>
+        <w:spacing w:after="80" w:before="240"/>
+      </w:pPr>
+      <w:r>
+        <w:rPr>
+          <w:rFonts w:ascii="Arial" w:cs="Arial" w:eastAsia="Arial" w:hAnsi="Arial"/>
+          <w:b/>
+          <w:bCs/>
+          <w:color w:val="374151"/>
+          <w:sz w:val="24"/>
+          <w:szCs w:val="24"/>
+        </w:rPr>
+        <w:t xml:space="preserve">Resolution Order</w:t>
+      </w:r>
+    </w:p>
+    <w:tbl>
+      <w:tblPr>
+        <w:tblW w:type="dxa" w:w="9360"/>
+        <w:tblBorders>
+          <w:top w:val="single" w:color="auto" w:sz="4"/>
+          <w:left w:val="single" w:color="auto" w:sz="4"/>
+          <w:bottom w:val="single" w:color="auto" w:sz="4"/>
+          <w:right w:val="single" w:color="auto" w:sz="4"/>
+          <w:insideH w:val="single" w:color="auto" w:sz="4"/>
+          <w:insideV w:val="single" w:color="auto" w:sz="4"/>
+        </w:tblBorders>
+      </w:tblPr>
+      <w:tblGrid>
+        <w:gridCol w:w="9360"/>
+      </w:tblGrid>
+      <w:tr>
+        <w:tc>
+          <w:tcPr>
+            <w:tcW w:type="dxa" w:w="9360"/>
+            <w:tcBorders>
+              <w:top w:val="single" w:color="D1D5DB" w:sz="1"/>
+              <w:left w:val="single" w:color="D1D5DB" w:sz="1"/>
+              <w:bottom w:val="single" w:color="D1D5DB" w:sz="1"/>
+              <w:right w:val="single" w:color="D1D5DB" w:sz="1"/>
+            </w:tcBorders>
+            <w:shd w:fill="F3F4F6" w:val="clear"/>
+            <w:tcMar>
+              <w:top w:type="dxa" w:w="120"/>
+              <w:left w:type="dxa" w:w="200"/>
+              <w:bottom w:type="dxa" w:w="120"/>
+              <w:right w:type="dxa" w:w="200"/>
+            </w:tcMar>
+          </w:tcPr>
+          <w:p>
+            <w:pPr>
+              <w:spacing w:after="0" w:before="0"/>
+            </w:pPr>
+            <w:r>
+              <w:rPr>
+                <w:rFonts w:ascii="Courier New" w:cs="Courier New" w:eastAsia="Courier New" w:hAnsi="Courier New"/>
+                <w:color w:val="1F2937"/>
+                <w:sz w:val="18"/>
+                <w:szCs w:val="18"/>
+              </w:rPr>
+              <w:t xml:space="preserve">1. Built-in CITY_COORDS table (instant, no network)</w:t>
+            </w:r>
+          </w:p>
+          <w:p>
+            <w:pPr>
+              <w:spacing w:after="0" w:before="0"/>
+            </w:pPr>
+            <w:r>
+              <w:rPr>
+                <w:rFonts w:ascii="Courier New" w:cs="Courier New" w:eastAsia="Courier New" w:hAnsi="Courier New"/>
+                <w:color w:val="1F2937"/>
+                <w:sz w:val="18"/>
+                <w:szCs w:val="18"/>
+              </w:rPr>
+              <w:t xml:space="preserve">   → 120+ major cities pre-loaded in server_selection.py</w:t>
+            </w:r>
+          </w:p>
+          <w:p>
+            <w:pPr>
+              <w:spacing w:after="0" w:before="0"/>
+            </w:pPr>
+            <w:r>
+              <w:rPr>
+                <w:rFonts w:ascii="Courier New" w:cs="Courier New" w:eastAsia="Courier New" w:hAnsi="Courier New"/>
+                <w:color w:val="1F2937"/>
+                <w:sz w:val="18"/>
+                <w:szCs w:val="18"/>
+              </w:rPr>
+              <w:t xml:space="preserve"> </w:t>
+            </w:r>
+          </w:p>
+          <w:p>
+            <w:pPr>
+              <w:spacing w:after="0" w:before="0"/>
+            </w:pPr>
+            <w:r>
+              <w:rPr>
+                <w:rFonts w:ascii="Courier New" w:cs="Courier New" w:eastAsia="Courier New" w:hAnsi="Courier New"/>
+                <w:color w:val="1F2937"/>
+                <w:sz w:val="18"/>
+                <w:szCs w:val="18"/>
+              </w:rPr>
+              <w:t xml:space="preserve">2. In-process memory cache _geocode_cache (instant, no network)</w:t>
+            </w:r>
+          </w:p>
+          <w:p>
+            <w:pPr>
+              <w:spacing w:after="0" w:before="0"/>
+            </w:pPr>
+            <w:r>
+              <w:rPr>
+                <w:rFonts w:ascii="Courier New" w:cs="Courier New" w:eastAsia="Courier New" w:hAnsi="Courier New"/>
+                <w:color w:val="1F2937"/>
+                <w:sz w:val="18"/>
+                <w:szCs w:val="18"/>
+              </w:rPr>
+              <w:t xml:space="preserve">   → cities looked up via Nominatim are cached indefinitely</w:t>
+            </w:r>
+          </w:p>
+          <w:p>
+            <w:pPr>
+              <w:spacing w:after="0" w:before="0"/>
+            </w:pPr>
+            <w:r>
+              <w:rPr>
+                <w:rFonts w:ascii="Courier New" w:cs="Courier New" w:eastAsia="Courier New" w:hAnsi="Courier New"/>
+                <w:color w:val="1F2937"/>
+                <w:sz w:val="18"/>
+                <w:szCs w:val="18"/>
+              </w:rPr>
+              <w:t xml:space="preserve"> </w:t>
+            </w:r>
+          </w:p>
+          <w:p>
+            <w:pPr>
+              <w:spacing w:after="0" w:before="0"/>
+            </w:pPr>
+            <w:r>
+              <w:rPr>
+                <w:rFonts w:ascii="Courier New" w:cs="Courier New" w:eastAsia="Courier New" w:hAnsi="Courier New"/>
+                <w:color w:val="1F2937"/>
+                <w:sz w:val="18"/>
+                <w:szCs w:val="18"/>
+              </w:rPr>
+              <w:t xml:space="preserve">3. OpenStreetMap Nominatim API (free, no API key, any city on Earth)</w:t>
+            </w:r>
+          </w:p>
+          <w:p>
+            <w:pPr>
+              <w:spacing w:after="0" w:before="0"/>
+            </w:pPr>
+            <w:r>
+              <w:rPr>
+                <w:rFonts w:ascii="Courier New" w:cs="Courier New" w:eastAsia="Courier New" w:hAnsi="Courier New"/>
+                <w:color w:val="1F2937"/>
+                <w:sz w:val="18"/>
+                <w:szCs w:val="18"/>
+              </w:rPr>
+              <w:t xml:space="preserve">   → rate-limited: max 1 request/second (Nominatim fair-use policy)</w:t>
+            </w:r>
+          </w:p>
+          <w:p>
+            <w:pPr>
+              <w:spacing w:after="0" w:before="0"/>
+            </w:pPr>
+            <w:r>
+              <w:rPr>
+                <w:rFonts w:ascii="Courier New" w:cs="Courier New" w:eastAsia="Courier New" w:hAnsi="Courier New"/>
+                <w:color w:val="1F2937"/>
+                <w:sz w:val="18"/>
+                <w:szCs w:val="18"/>
+              </w:rPr>
+              <w:t xml:space="preserve">   → 200–500 ms typical, 5 second timeout</w:t>
+            </w:r>
+          </w:p>
+          <w:p>
+            <w:pPr>
+              <w:spacing w:after="0" w:before="0"/>
+            </w:pPr>
+            <w:r>
+              <w:rPr>
+                <w:rFonts w:ascii="Courier New" w:cs="Courier New" w:eastAsia="Courier New" w:hAnsi="Courier New"/>
+                <w:color w:val="1F2937"/>
+                <w:sz w:val="18"/>
+                <w:szCs w:val="18"/>
+              </w:rPr>
+              <w:t xml:space="preserve">   → User-Agent: agentns/1.0.0</w:t>
+            </w:r>
+          </w:p>
+          <w:p>
+            <w:pPr>
+              <w:spacing w:after="0" w:before="0"/>
+            </w:pPr>
+            <w:r>
+              <w:rPr>
+                <w:rFonts w:ascii="Courier New" w:cs="Courier New" w:eastAsia="Courier New" w:hAnsi="Courier New"/>
+                <w:color w:val="1F2937"/>
+                <w:sz w:val="18"/>
+                <w:szCs w:val="18"/>
+              </w:rPr>
+              <w:t xml:space="preserve"> </w:t>
+            </w:r>
+          </w:p>
+          <w:p>
+            <w:pPr>
+              <w:spacing w:after="0" w:before="0"/>
+            </w:pPr>
+            <w:r>
+              <w:rPr>
+                <w:rFonts w:ascii="Courier New" w:cs="Courier New" w:eastAsia="Courier New" w:hAnsi="Courier New"/>
+                <w:color w:val="1F2937"/>
+                <w:sz w:val="18"/>
+                <w:szCs w:val="18"/>
+              </w:rPr>
+              <w:t xml:space="preserve">4. Returns None — geo-routing disabled for that endpoint (never raises)</w:t>
+            </w:r>
+          </w:p>
+          <w:p>
+            <w:pPr>
+              <w:spacing w:after="0" w:before="0"/>
+            </w:pPr>
+            <w:r>
+              <w:rPr>
+                <w:rFonts w:ascii="Courier New" w:cs="Courier New" w:eastAsia="Courier New" w:hAnsi="Courier New"/>
+                <w:color w:val="1F2937"/>
+                <w:sz w:val="18"/>
+                <w:szCs w:val="18"/>
+              </w:rPr>
+              <w:t xml:space="preserve">   → a warning is logged suggesting the caller pass explicit lat/lon</w:t>
+            </w:r>
+          </w:p>
+        </w:tc>
+      </w:tr>
+    </w:tbl>
+    <w:p>
+      <w:pPr>
+        <w:spacing w:after="120" w:before="0"/>
+      </w:pPr>
+      <w:r>
+        <w:t xml:space="preserve"/>
+      </w:r>
+    </w:p>
+    <w:p>
+      <w:pPr>
+        <w:pStyle w:val="Heading3"/>
+        <w:spacing w:after="80" w:before="240"/>
+      </w:pPr>
+      <w:r>
+        <w:rPr>
+          <w:rFonts w:ascii="Arial" w:cs="Arial" w:eastAsia="Arial" w:hAnsi="Arial"/>
+          <w:b/>
+          <w:bCs/>
+          <w:color w:val="374151"/>
+          <w:sz w:val="24"/>
+          <w:szCs w:val="24"/>
+        </w:rPr>
+        <w:t xml:space="preserve">Module Constants and State</w:t>
+      </w:r>
+    </w:p>
+    <w:p>
+      <w:pPr>
+        <w:spacing w:after="40" w:before="0"/>
+      </w:pPr>
+      <w:r>
+        <w:t xml:space="preserve"/>
+      </w:r>
+    </w:p>
+    <w:tbl>
+      <w:tblPr>
+        <w:tblW w:type="dxa" w:w="9360"/>
+        <w:tblBorders>
+          <w:top w:val="single" w:color="auto" w:sz="4"/>
+          <w:left w:val="single" w:color="auto" w:sz="4"/>
+          <w:bottom w:val="single" w:color="auto" w:sz="4"/>
+          <w:right w:val="single" w:color="auto" w:sz="4"/>
+          <w:insideH w:val="single" w:color="auto" w:sz="4"/>
+          <w:insideV w:val="single" w:color="auto" w:sz="4"/>
+        </w:tblBorders>
+      </w:tblPr>
+      <w:tblGrid>
+        <w:gridCol w:w="2400"/>
+        <w:gridCol w:w="1800"/>
+        <w:gridCol w:w="5160"/>
+      </w:tblGrid>
+      <w:tr>
+        <w:tc>
+          <w:tcPr>
+            <w:tcW w:type="dxa" w:w="2400"/>
+            <w:tcBorders>
+              <w:top w:val="single" w:color="FFFFFF" w:sz="1"/>
+              <w:left w:val="single" w:color="FFFFFF" w:sz="1"/>
+              <w:bottom w:val="single" w:color="FFFFFF" w:sz="1"/>
+              <w:right w:val="single" w:color="FFFFFF" w:sz="1"/>
+            </w:tcBorders>
+            <w:shd w:fill="1B3A6B" w:val="clear"/>
+            <w:tcMar>
+              <w:top w:type="dxa" w:w="100"/>
+              <w:left w:type="dxa" w:w="150"/>
+              <w:bottom w:type="dxa" w:w="100"/>
+              <w:right w:type="dxa" w:w="150"/>
+            </w:tcMar>
+          </w:tcPr>
+          <w:p>
+            <w:pPr>
+              <w:spacing w:after="0" w:before="0"/>
+            </w:pPr>
+            <w:r>
+              <w:rPr>
+                <w:rFonts w:ascii="Arial" w:cs="Arial" w:eastAsia="Arial" w:hAnsi="Arial"/>
+                <w:b/>
+                <w:bCs/>
+                <w:color w:val="FFFFFF"/>
+                <w:sz w:val="20"/>
+                <w:szCs w:val="20"/>
+              </w:rPr>
+              <w:t xml:space="preserve">Name</w:t>
+            </w:r>
+          </w:p>
+        </w:tc>
+        <w:tc>
+          <w:tcPr>
+            <w:tcW w:type="dxa" w:w="1800"/>
+            <w:tcBorders>
+              <w:top w:val="single" w:color="FFFFFF" w:sz="1"/>
+              <w:left w:val="single" w:color="FFFFFF" w:sz="1"/>
+              <w:bottom w:val="single" w:color="FFFFFF" w:sz="1"/>
+              <w:right w:val="single" w:color="FFFFFF" w:sz="1"/>
+            </w:tcBorders>
+            <w:shd w:fill="1B3A6B" w:val="clear"/>
+            <w:tcMar>
+              <w:top w:type="dxa" w:w="100"/>
+              <w:left w:type="dxa" w:w="150"/>
+              <w:bottom w:type="dxa" w:w="100"/>
+              <w:right w:type="dxa" w:w="150"/>
+            </w:tcMar>
+          </w:tcPr>
+          <w:p>
+            <w:pPr>
+              <w:spacing w:after="0" w:before="0"/>
+            </w:pPr>
+            <w:r>
+              <w:rPr>
+                <w:rFonts w:ascii="Arial" w:cs="Arial" w:eastAsia="Arial" w:hAnsi="Arial"/>
+                <w:b/>
+                <w:bCs/>
+                <w:color w:val="FFFFFF"/>
+                <w:sz w:val="20"/>
+                <w:szCs w:val="20"/>
+              </w:rPr>
+              <w:t xml:space="preserve">Type</w:t>
+            </w:r>
+          </w:p>
+        </w:tc>
+        <w:tc>
+          <w:tcPr>
+            <w:tcW w:type="dxa" w:w="5160"/>
+            <w:tcBorders>
+              <w:top w:val="single" w:color="FFFFFF" w:sz="1"/>
+              <w:left w:val="single" w:color="FFFFFF" w:sz="1"/>
+              <w:bottom w:val="single" w:color="FFFFFF" w:sz="1"/>
+              <w:right w:val="single" w:color="FFFFFF" w:sz="1"/>
+            </w:tcBorders>
+            <w:shd w:fill="1B3A6B" w:val="clear"/>
+            <w:tcMar>
+              <w:top w:type="dxa" w:w="100"/>
+              <w:left w:type="dxa" w:w="150"/>
+              <w:bottom w:type="dxa" w:w="100"/>
+              <w:right w:type="dxa" w:w="150"/>
+            </w:tcMar>
+          </w:tcPr>
+          <w:p>
+            <w:pPr>
+              <w:spacing w:after="0" w:before="0"/>
+            </w:pPr>
+            <w:r>
+              <w:rPr>
+                <w:rFonts w:ascii="Arial" w:cs="Arial" w:eastAsia="Arial" w:hAnsi="Arial"/>
+                <w:b/>
+                <w:bCs/>
+                <w:color w:val="FFFFFF"/>
+                <w:sz w:val="20"/>
+                <w:szCs w:val="20"/>
+              </w:rPr>
+              <w:t xml:space="preserve">Description</w:t>
+            </w:r>
+          </w:p>
+        </w:tc>
+      </w:tr>
+      <w:tr>
+        <w:tc>
+          <w:tcPr>
+            <w:tcW w:type="dxa" w:w="2400"/>
+            <w:tcBorders>
+              <w:top w:val="single" w:color="D1D5DB" w:sz="1"/>
+              <w:left w:val="single" w:color="D1D5DB" w:sz="1"/>
+              <w:bottom w:val="single" w:color="D1D5DB" w:sz="1"/>
+              <w:right w:val="single" w:color="D1D5DB" w:sz="1"/>
+            </w:tcBorders>
+            <w:shd w:fill="FFFFFF" w:val="clear"/>
+            <w:tcMar>
+              <w:top w:type="dxa" w:w="80"/>
+              <w:left w:type="dxa" w:w="150"/>
+              <w:bottom w:type="dxa" w:w="80"/>
+              <w:right w:type="dxa" w:w="150"/>
+            </w:tcMar>
+          </w:tcPr>
+          <w:p>
+            <w:pPr>
+              <w:spacing w:after="0" w:before="0"/>
+            </w:pPr>
+            <w:r>
+              <w:rPr>
+                <w:rFonts w:ascii="Arial" w:cs="Arial" w:eastAsia="Arial" w:hAnsi="Arial"/>
+                <w:color w:val="374151"/>
+                <w:sz w:val="20"/>
+                <w:szCs w:val="20"/>
+              </w:rPr>
+              <w:t xml:space="preserve">GEOCODING_ENABLED</w:t>
+            </w:r>
+          </w:p>
+        </w:tc>
+        <w:tc>
+          <w:tcPr>
+            <w:tcW w:type="dxa" w:w="1800"/>
+            <w:tcBorders>
+              <w:top w:val="single" w:color="D1D5DB" w:sz="1"/>
+              <w:left w:val="single" w:color="D1D5DB" w:sz="1"/>
+              <w:bottom w:val="single" w:color="D1D5DB" w:sz="1"/>
+              <w:right w:val="single" w:color="D1D5DB" w:sz="1"/>
+            </w:tcBorders>
+            <w:shd w:fill="FFFFFF" w:val="clear"/>
+            <w:tcMar>
+              <w:top w:type="dxa" w:w="80"/>
+              <w:left w:type="dxa" w:w="150"/>
+              <w:bottom w:type="dxa" w:w="80"/>
+              <w:right w:type="dxa" w:w="150"/>
+            </w:tcMar>
+          </w:tcPr>
+          <w:p>
+            <w:pPr>
+              <w:spacing w:after="0" w:before="0"/>
+            </w:pPr>
+            <w:r>
+              <w:rPr>
+                <w:rFonts w:ascii="Arial" w:cs="Arial" w:eastAsia="Arial" w:hAnsi="Arial"/>
+                <w:color w:val="374151"/>
+                <w:sz w:val="20"/>
+                <w:szCs w:val="20"/>
+              </w:rPr>
+              <w:t xml:space="preserve">bool</w:t>
+            </w:r>
+          </w:p>
+        </w:tc>
+        <w:tc>
+          <w:tcPr>
+            <w:tcW w:type="dxa" w:w="5160"/>
+            <w:tcBorders>
+              <w:top w:val="single" w:color="D1D5DB" w:sz="1"/>
+              <w:left w:val="single" w:color="D1D5DB" w:sz="1"/>
+              <w:bottom w:val="single" w:color="D1D5DB" w:sz="1"/>
+              <w:right w:val="single" w:color="D1D5DB" w:sz="1"/>
+            </w:tcBorders>
+            <w:shd w:fill="FFFFFF" w:val="clear"/>
+            <w:tcMar>
+              <w:top w:type="dxa" w:w="80"/>
+              <w:left w:type="dxa" w:w="150"/>
+              <w:bottom w:type="dxa" w:w="80"/>
+              <w:right w:type="dxa" w:w="150"/>
+            </w:tcMar>
+          </w:tcPr>
+          <w:p>
+            <w:pPr>
+              <w:spacing w:after="0" w:before="0"/>
+            </w:pPr>
+            <w:r>
+              <w:rPr>
+                <w:rFonts w:ascii="Arial" w:cs="Arial" w:eastAsia="Arial" w:hAnsi="Arial"/>
+                <w:color w:val="374151"/>
+                <w:sz w:val="20"/>
+                <w:szCs w:val="20"/>
+              </w:rPr>
+              <w:t xml:space="preserve">Read from AGENTNS_GEOCODING env var. Set to 'off' to disable Nominatim calls entirely (air-gapped environments). Built-in table and cache still work.</w:t>
+            </w:r>
+          </w:p>
+        </w:tc>
+      </w:tr>
+      <w:tr>
+        <w:tc>
+          <w:tcPr>
+            <w:tcW w:type="dxa" w:w="2400"/>
+            <w:tcBorders>
+              <w:top w:val="single" w:color="D1D5DB" w:sz="1"/>
+              <w:left w:val="single" w:color="D1D5DB" w:sz="1"/>
+              <w:bottom w:val="single" w:color="D1D5DB" w:sz="1"/>
+              <w:right w:val="single" w:color="D1D5DB" w:sz="1"/>
+            </w:tcBorders>
+            <w:shd w:fill="EFF6FF" w:val="clear"/>
+            <w:tcMar>
+              <w:top w:type="dxa" w:w="80"/>
+              <w:left w:type="dxa" w:w="150"/>
+              <w:bottom w:type="dxa" w:w="80"/>
+              <w:right w:type="dxa" w:w="150"/>
+            </w:tcMar>
+          </w:tcPr>
+          <w:p>
+            <w:pPr>
+              <w:spacing w:after="0" w:before="0"/>
+            </w:pPr>
+            <w:r>
+              <w:rPr>
+                <w:rFonts w:ascii="Arial" w:cs="Arial" w:eastAsia="Arial" w:hAnsi="Arial"/>
+                <w:color w:val="374151"/>
+                <w:sz w:val="20"/>
+                <w:szCs w:val="20"/>
+              </w:rPr>
+              <w:t xml:space="preserve">NOMINATIM_URL</w:t>
+            </w:r>
+          </w:p>
+        </w:tc>
+        <w:tc>
+          <w:tcPr>
+            <w:tcW w:type="dxa" w:w="1800"/>
+            <w:tcBorders>
+              <w:top w:val="single" w:color="D1D5DB" w:sz="1"/>
+              <w:left w:val="single" w:color="D1D5DB" w:sz="1"/>
+              <w:bottom w:val="single" w:color="D1D5DB" w:sz="1"/>
+              <w:right w:val="single" w:color="D1D5DB" w:sz="1"/>
+            </w:tcBorders>
+            <w:shd w:fill="EFF6FF" w:val="clear"/>
+            <w:tcMar>
+              <w:top w:type="dxa" w:w="80"/>
+              <w:left w:type="dxa" w:w="150"/>
+              <w:bottom w:type="dxa" w:w="80"/>
+              <w:right w:type="dxa" w:w="150"/>
+            </w:tcMar>
+          </w:tcPr>
+          <w:p>
+            <w:pPr>
+              <w:spacing w:after="0" w:before="0"/>
+            </w:pPr>
+            <w:r>
+              <w:rPr>
+                <w:rFonts w:ascii="Arial" w:cs="Arial" w:eastAsia="Arial" w:hAnsi="Arial"/>
+                <w:color w:val="374151"/>
+                <w:sz w:val="20"/>
+                <w:szCs w:val="20"/>
+              </w:rPr>
+              <w:t xml:space="preserve">str</w:t>
+            </w:r>
+          </w:p>
+        </w:tc>
+        <w:tc>
+          <w:tcPr>
+            <w:tcW w:type="dxa" w:w="5160"/>
+            <w:tcBorders>
+              <w:top w:val="single" w:color="D1D5DB" w:sz="1"/>
+              <w:left w:val="single" w:color="D1D5DB" w:sz="1"/>
+              <w:bottom w:val="single" w:color="D1D5DB" w:sz="1"/>
+              <w:right w:val="single" w:color="D1D5DB" w:sz="1"/>
+            </w:tcBorders>
+            <w:shd w:fill="EFF6FF" w:val="clear"/>
+            <w:tcMar>
+              <w:top w:type="dxa" w:w="80"/>
+              <w:left w:type="dxa" w:w="150"/>
+              <w:bottom w:type="dxa" w:w="80"/>
+              <w:right w:type="dxa" w:w="150"/>
+            </w:tcMar>
+          </w:tcPr>
+          <w:p>
+            <w:pPr>
+              <w:spacing w:after="0" w:before="0"/>
+            </w:pPr>
+            <w:r>
+              <w:rPr>
+                <w:rFonts w:ascii="Arial" w:cs="Arial" w:eastAsia="Arial" w:hAnsi="Arial"/>
+                <w:color w:val="374151"/>
+                <w:sz w:val="20"/>
+                <w:szCs w:val="20"/>
+              </w:rPr>
+              <w:t xml:space="preserve">https://nominatim.openstreetmap.org/search — OpenStreetMap geocoding API</w:t>
+            </w:r>
+          </w:p>
+        </w:tc>
+      </w:tr>
+      <w:tr>
+        <w:tc>
+          <w:tcPr>
+            <w:tcW w:type="dxa" w:w="2400"/>
+            <w:tcBorders>
+              <w:top w:val="single" w:color="D1D5DB" w:sz="1"/>
+              <w:left w:val="single" w:color="D1D5DB" w:sz="1"/>
+              <w:bottom w:val="single" w:color="D1D5DB" w:sz="1"/>
+              <w:right w:val="single" w:color="D1D5DB" w:sz="1"/>
+            </w:tcBorders>
+            <w:shd w:fill="FFFFFF" w:val="clear"/>
+            <w:tcMar>
+              <w:top w:type="dxa" w:w="80"/>
+              <w:left w:type="dxa" w:w="150"/>
+              <w:bottom w:type="dxa" w:w="80"/>
+              <w:right w:type="dxa" w:w="150"/>
+            </w:tcMar>
+          </w:tcPr>
+          <w:p>
+            <w:pPr>
+              <w:spacing w:after="0" w:before="0"/>
+            </w:pPr>
+            <w:r>
+              <w:rPr>
+                <w:rFonts w:ascii="Arial" w:cs="Arial" w:eastAsia="Arial" w:hAnsi="Arial"/>
+                <w:color w:val="374151"/>
+                <w:sz w:val="20"/>
+                <w:szCs w:val="20"/>
+              </w:rPr>
+              <w:t xml:space="preserve">NOMINATIM_TIMEOUT</w:t>
+            </w:r>
+          </w:p>
+        </w:tc>
+        <w:tc>
+          <w:tcPr>
+            <w:tcW w:type="dxa" w:w="1800"/>
+            <w:tcBorders>
+              <w:top w:val="single" w:color="D1D5DB" w:sz="1"/>
+              <w:left w:val="single" w:color="D1D5DB" w:sz="1"/>
+              <w:bottom w:val="single" w:color="D1D5DB" w:sz="1"/>
+              <w:right w:val="single" w:color="D1D5DB" w:sz="1"/>
+            </w:tcBorders>
+            <w:shd w:fill="FFFFFF" w:val="clear"/>
+            <w:tcMar>
+              <w:top w:type="dxa" w:w="80"/>
+              <w:left w:type="dxa" w:w="150"/>
+              <w:bottom w:type="dxa" w:w="80"/>
+              <w:right w:type="dxa" w:w="150"/>
+            </w:tcMar>
+          </w:tcPr>
+          <w:p>
+            <w:pPr>
+              <w:spacing w:after="0" w:before="0"/>
+            </w:pPr>
+            <w:r>
+              <w:rPr>
+                <w:rFonts w:ascii="Arial" w:cs="Arial" w:eastAsia="Arial" w:hAnsi="Arial"/>
+                <w:color w:val="374151"/>
+                <w:sz w:val="20"/>
+                <w:szCs w:val="20"/>
+              </w:rPr>
+              <w:t xml:space="preserve">float</w:t>
+            </w:r>
+          </w:p>
+        </w:tc>
+        <w:tc>
+          <w:tcPr>
+            <w:tcW w:type="dxa" w:w="5160"/>
+            <w:tcBorders>
+              <w:top w:val="single" w:color="D1D5DB" w:sz="1"/>
+              <w:left w:val="single" w:color="D1D5DB" w:sz="1"/>
+              <w:bottom w:val="single" w:color="D1D5DB" w:sz="1"/>
+              <w:right w:val="single" w:color="D1D5DB" w:sz="1"/>
+            </w:tcBorders>
+            <w:shd w:fill="FFFFFF" w:val="clear"/>
+            <w:tcMar>
+              <w:top w:type="dxa" w:w="80"/>
+              <w:left w:type="dxa" w:w="150"/>
+              <w:bottom w:type="dxa" w:w="80"/>
+              <w:right w:type="dxa" w:w="150"/>
+            </w:tcMar>
+          </w:tcPr>
+          <w:p>
+            <w:pPr>
+              <w:spacing w:after="0" w:before="0"/>
+            </w:pPr>
+            <w:r>
+              <w:rPr>
+                <w:rFonts w:ascii="Arial" w:cs="Arial" w:eastAsia="Arial" w:hAnsi="Arial"/>
+                <w:color w:val="374151"/>
+                <w:sz w:val="20"/>
+                <w:szCs w:val="20"/>
+              </w:rPr>
+              <w:t xml:space="preserve">5.0 seconds — HTTP timeout for Nominatim requests</w:t>
+            </w:r>
+          </w:p>
+        </w:tc>
+      </w:tr>
+      <w:tr>
+        <w:tc>
+          <w:tcPr>
+            <w:tcW w:type="dxa" w:w="2400"/>
+            <w:tcBorders>
+              <w:top w:val="single" w:color="D1D5DB" w:sz="1"/>
+              <w:left w:val="single" w:color="D1D5DB" w:sz="1"/>
+              <w:bottom w:val="single" w:color="D1D5DB" w:sz="1"/>
+              <w:right w:val="single" w:color="D1D5DB" w:sz="1"/>
+            </w:tcBorders>
+            <w:shd w:fill="EFF6FF" w:val="clear"/>
+            <w:tcMar>
+              <w:top w:type="dxa" w:w="80"/>
+              <w:left w:type="dxa" w:w="150"/>
+              <w:bottom w:type="dxa" w:w="80"/>
+              <w:right w:type="dxa" w:w="150"/>
+            </w:tcMar>
+          </w:tcPr>
+          <w:p>
+            <w:pPr>
+              <w:spacing w:after="0" w:before="0"/>
+            </w:pPr>
+            <w:r>
+              <w:rPr>
+                <w:rFonts w:ascii="Arial" w:cs="Arial" w:eastAsia="Arial" w:hAnsi="Arial"/>
+                <w:color w:val="374151"/>
+                <w:sz w:val="20"/>
+                <w:szCs w:val="20"/>
+              </w:rPr>
+              <w:t xml:space="preserve">_geocode_cache</w:t>
+            </w:r>
+          </w:p>
+        </w:tc>
+        <w:tc>
+          <w:tcPr>
+            <w:tcW w:type="dxa" w:w="1800"/>
+            <w:tcBorders>
+              <w:top w:val="single" w:color="D1D5DB" w:sz="1"/>
+              <w:left w:val="single" w:color="D1D5DB" w:sz="1"/>
+              <w:bottom w:val="single" w:color="D1D5DB" w:sz="1"/>
+              <w:right w:val="single" w:color="D1D5DB" w:sz="1"/>
+            </w:tcBorders>
+            <w:shd w:fill="EFF6FF" w:val="clear"/>
+            <w:tcMar>
+              <w:top w:type="dxa" w:w="80"/>
+              <w:left w:type="dxa" w:w="150"/>
+              <w:bottom w:type="dxa" w:w="80"/>
+              <w:right w:type="dxa" w:w="150"/>
+            </w:tcMar>
+          </w:tcPr>
+          <w:p>
+            <w:pPr>
+              <w:spacing w:after="0" w:before="0"/>
+            </w:pPr>
+            <w:r>
+              <w:rPr>
+                <w:rFonts w:ascii="Arial" w:cs="Arial" w:eastAsia="Arial" w:hAnsi="Arial"/>
+                <w:color w:val="374151"/>
+                <w:sz w:val="20"/>
+                <w:szCs w:val="20"/>
+              </w:rPr>
+              <w:t xml:space="preserve">Dict[str, Optional[Tuple]]</w:t>
+            </w:r>
+          </w:p>
+        </w:tc>
+        <w:tc>
+          <w:tcPr>
+            <w:tcW w:type="dxa" w:w="5160"/>
+            <w:tcBorders>
+              <w:top w:val="single" w:color="D1D5DB" w:sz="1"/>
+              <w:left w:val="single" w:color="D1D5DB" w:sz="1"/>
+              <w:bottom w:val="single" w:color="D1D5DB" w:sz="1"/>
+              <w:right w:val="single" w:color="D1D5DB" w:sz="1"/>
+            </w:tcBorders>
+            <w:shd w:fill="EFF6FF" w:val="clear"/>
+            <w:tcMar>
+              <w:top w:type="dxa" w:w="80"/>
+              <w:left w:type="dxa" w:w="150"/>
+              <w:bottom w:type="dxa" w:w="80"/>
+              <w:right w:type="dxa" w:w="150"/>
+            </w:tcMar>
+          </w:tcPr>
+          <w:p>
+            <w:pPr>
+              <w:spacing w:after="0" w:before="0"/>
+            </w:pPr>
+            <w:r>
+              <w:rPr>
+                <w:rFonts w:ascii="Arial" w:cs="Arial" w:eastAsia="Arial" w:hAnsi="Arial"/>
+                <w:color w:val="374151"/>
+                <w:sz w:val="20"/>
+                <w:szCs w:val="20"/>
+              </w:rPr>
+              <w:t xml:space="preserve">In-process memory cache: city_key (lowercase) → (lat, lon) or None. Never expires — city coordinates don't change.</w:t>
+            </w:r>
+          </w:p>
+        </w:tc>
+      </w:tr>
+      <w:tr>
+        <w:tc>
+          <w:tcPr>
+            <w:tcW w:type="dxa" w:w="2400"/>
+            <w:tcBorders>
+              <w:top w:val="single" w:color="D1D5DB" w:sz="1"/>
+              <w:left w:val="single" w:color="D1D5DB" w:sz="1"/>
+              <w:bottom w:val="single" w:color="D1D5DB" w:sz="1"/>
+              <w:right w:val="single" w:color="D1D5DB" w:sz="1"/>
+            </w:tcBorders>
+            <w:shd w:fill="FFFFFF" w:val="clear"/>
+            <w:tcMar>
+              <w:top w:type="dxa" w:w="80"/>
+              <w:left w:type="dxa" w:w="150"/>
+              <w:bottom w:type="dxa" w:w="80"/>
+              <w:right w:type="dxa" w:w="150"/>
+            </w:tcMar>
+          </w:tcPr>
+          <w:p>
+            <w:pPr>
+              <w:spacing w:after="0" w:before="0"/>
+            </w:pPr>
+            <w:r>
+              <w:rPr>
+                <w:rFonts w:ascii="Arial" w:cs="Arial" w:eastAsia="Arial" w:hAnsi="Arial"/>
+                <w:color w:val="374151"/>
+                <w:sz w:val="20"/>
+                <w:szCs w:val="20"/>
+              </w:rPr>
+              <w:t xml:space="preserve">_last_request_time</w:t>
+            </w:r>
+          </w:p>
+        </w:tc>
+        <w:tc>
+          <w:tcPr>
+            <w:tcW w:type="dxa" w:w="1800"/>
+            <w:tcBorders>
+              <w:top w:val="single" w:color="D1D5DB" w:sz="1"/>
+              <w:left w:val="single" w:color="D1D5DB" w:sz="1"/>
+              <w:bottom w:val="single" w:color="D1D5DB" w:sz="1"/>
+              <w:right w:val="single" w:color="D1D5DB" w:sz="1"/>
+            </w:tcBorders>
+            <w:shd w:fill="FFFFFF" w:val="clear"/>
+            <w:tcMar>
+              <w:top w:type="dxa" w:w="80"/>
+              <w:left w:type="dxa" w:w="150"/>
+              <w:bottom w:type="dxa" w:w="80"/>
+              <w:right w:type="dxa" w:w="150"/>
+            </w:tcMar>
+          </w:tcPr>
+          <w:p>
+            <w:pPr>
+              <w:spacing w:after="0" w:before="0"/>
+            </w:pPr>
+            <w:r>
+              <w:rPr>
+                <w:rFonts w:ascii="Arial" w:cs="Arial" w:eastAsia="Arial" w:hAnsi="Arial"/>
+                <w:color w:val="374151"/>
+                <w:sz w:val="20"/>
+                <w:szCs w:val="20"/>
+              </w:rPr>
+              <w:t xml:space="preserve">float</w:t>
+            </w:r>
+          </w:p>
+        </w:tc>
+        <w:tc>
+          <w:tcPr>
+            <w:tcW w:type="dxa" w:w="5160"/>
+            <w:tcBorders>
+              <w:top w:val="single" w:color="D1D5DB" w:sz="1"/>
+              <w:left w:val="single" w:color="D1D5DB" w:sz="1"/>
+              <w:bottom w:val="single" w:color="D1D5DB" w:sz="1"/>
+              <w:right w:val="single" w:color="D1D5DB" w:sz="1"/>
+            </w:tcBorders>
+            <w:shd w:fill="FFFFFF" w:val="clear"/>
+            <w:tcMar>
+              <w:top w:type="dxa" w:w="80"/>
+              <w:left w:type="dxa" w:w="150"/>
+              <w:bottom w:type="dxa" w:w="80"/>
+              <w:right w:type="dxa" w:w="150"/>
+            </w:tcMar>
+          </w:tcPr>
+          <w:p>
+            <w:pPr>
+              <w:spacing w:after="0" w:before="0"/>
+            </w:pPr>
+            <w:r>
+              <w:rPr>
+                <w:rFonts w:ascii="Arial" w:cs="Arial" w:eastAsia="Arial" w:hAnsi="Arial"/>
+                <w:color w:val="374151"/>
+                <w:sz w:val="20"/>
+                <w:szCs w:val="20"/>
+              </w:rPr>
+              <w:t xml:space="preserve">Monotonic timestamp of last Nominatim request, used to enforce 1 req/s rate limit</w:t>
+            </w:r>
+          </w:p>
+        </w:tc>
+      </w:tr>
+    </w:tbl>
+    <w:p>
+      <w:pPr>
+        <w:spacing w:after="120" w:before="0"/>
+      </w:pPr>
+      <w:r>
+        <w:t xml:space="preserve"/>
+      </w:r>
+    </w:p>
+    <w:p>
+      <w:pPr>
+        <w:pStyle w:val="Heading3"/>
+        <w:spacing w:after="80" w:before="240"/>
+      </w:pPr>
+      <w:r>
+        <w:rPr>
+          <w:rFonts w:ascii="Arial" w:cs="Arial" w:eastAsia="Arial" w:hAnsi="Arial"/>
+          <w:b/>
+          <w:bCs/>
+          <w:color w:val="374151"/>
+          <w:sz w:val="24"/>
+          <w:szCs w:val="24"/>
+        </w:rPr>
+        <w:t xml:space="preserve">Function Reference — geocoder.py</w:t>
+      </w:r>
+    </w:p>
+    <w:p>
+      <w:pPr>
+        <w:spacing w:after="80" w:before="0"/>
+      </w:pPr>
+      <w:r>
+        <w:t xml:space="preserve"/>
+      </w:r>
+    </w:p>
+    <w:tbl>
+      <w:tblPr>
+        <w:tblW w:type="dxa" w:w="9360"/>
+        <w:tblBorders>
+          <w:top w:val="single" w:color="auto" w:sz="4"/>
+          <w:left w:val="single" w:color="auto" w:sz="4"/>
+          <w:bottom w:val="single" w:color="auto" w:sz="4"/>
+          <w:right w:val="single" w:color="auto" w:sz="4"/>
+          <w:insideH w:val="single" w:color="auto" w:sz="4"/>
+          <w:insideV w:val="single" w:color="auto" w:sz="4"/>
+        </w:tblBorders>
+      </w:tblPr>
+      <w:tblGrid>
+        <w:gridCol w:w="2600"/>
+        <w:gridCol w:w="6760"/>
+      </w:tblGrid>
+      <w:tr>
+        <w:tc>
+          <w:tcPr>
+            <w:tcW w:type="dxa" w:w="2600"/>
+            <w:tcBorders>
+              <w:top w:val="single" w:color="FFFFFF" w:sz="1"/>
+              <w:left w:val="single" w:color="FFFFFF" w:sz="1"/>
+              <w:bottom w:val="single" w:color="FFFFFF" w:sz="1"/>
+              <w:right w:val="single" w:color="FFFFFF" w:sz="1"/>
+            </w:tcBorders>
+            <w:shd w:fill="1B3A6B" w:val="clear"/>
+            <w:tcMar>
+              <w:top w:type="dxa" w:w="100"/>
+              <w:left w:type="dxa" w:w="150"/>
+              <w:bottom w:type="dxa" w:w="100"/>
+              <w:right w:type="dxa" w:w="150"/>
+            </w:tcMar>
+          </w:tcPr>
+          <w:p>
+            <w:pPr>
+              <w:spacing w:after="0" w:before="0"/>
+            </w:pPr>
+            <w:r>
+              <w:rPr>
+                <w:rFonts w:ascii="Arial" w:cs="Arial" w:eastAsia="Arial" w:hAnsi="Arial"/>
+                <w:b/>
+                <w:bCs/>
+                <w:color w:val="FFFFFF"/>
+                <w:sz w:val="20"/>
+                <w:szCs w:val="20"/>
+              </w:rPr>
+              <w:t xml:space="preserve">Function</w:t>
+            </w:r>
+          </w:p>
+        </w:tc>
+        <w:tc>
+          <w:tcPr>
+            <w:tcW w:type="dxa" w:w="6760"/>
+            <w:tcBorders>
+              <w:top w:val="single" w:color="FFFFFF" w:sz="1"/>
+              <w:left w:val="single" w:color="FFFFFF" w:sz="1"/>
+              <w:bottom w:val="single" w:color="FFFFFF" w:sz="1"/>
+              <w:right w:val="single" w:color="FFFFFF" w:sz="1"/>
+            </w:tcBorders>
+            <w:shd w:fill="1B3A6B" w:val="clear"/>
+            <w:tcMar>
+              <w:top w:type="dxa" w:w="100"/>
+              <w:left w:type="dxa" w:w="150"/>
+              <w:bottom w:type="dxa" w:w="100"/>
+              <w:right w:type="dxa" w:w="150"/>
+            </w:tcMar>
+          </w:tcPr>
+          <w:p>
+            <w:pPr>
+              <w:spacing w:after="0" w:before="0"/>
+            </w:pPr>
+            <w:r>
+              <w:rPr>
+                <w:rFonts w:ascii="Arial" w:cs="Arial" w:eastAsia="Arial" w:hAnsi="Arial"/>
+                <w:b/>
+                <w:bCs/>
+                <w:color w:val="FFFFFF"/>
+                <w:sz w:val="20"/>
+                <w:szCs w:val="20"/>
+              </w:rPr>
+              <w:t xml:space="preserve">Description</w:t>
+            </w:r>
+          </w:p>
+        </w:tc>
+      </w:tr>
+      <w:tr>
+        <w:tc>
+          <w:tcPr>
+            <w:tcW w:type="dxa" w:w="2600"/>
+            <w:tcBorders>
+              <w:top w:val="single" w:color="D1D5DB" w:sz="1"/>
+              <w:left w:val="single" w:color="D1D5DB" w:sz="1"/>
+              <w:bottom w:val="single" w:color="D1D5DB" w:sz="1"/>
+              <w:right w:val="single" w:color="D1D5DB" w:sz="1"/>
+            </w:tcBorders>
+            <w:shd w:fill="FFFFFF" w:val="clear"/>
+            <w:tcMar>
+              <w:top w:type="dxa" w:w="80"/>
+              <w:left w:type="dxa" w:w="150"/>
+              <w:bottom w:type="dxa" w:w="80"/>
+              <w:right w:type="dxa" w:w="150"/>
+            </w:tcMar>
+          </w:tcPr>
+          <w:p>
+            <w:pPr>
+              <w:spacing w:after="0" w:before="0"/>
+            </w:pPr>
+            <w:r>
+              <w:rPr>
+                <w:rFonts w:ascii="Arial" w:cs="Arial" w:eastAsia="Arial" w:hAnsi="Arial"/>
+                <w:color w:val="374151"/>
+                <w:sz w:val="20"/>
+                <w:szCs w:val="20"/>
+              </w:rPr>
+              <w:t xml:space="preserve">_wait_for_rate_limit()</w:t>
+            </w:r>
+          </w:p>
+        </w:tc>
+        <w:tc>
+          <w:tcPr>
+            <w:tcW w:type="dxa" w:w="6760"/>
+            <w:tcBorders>
+              <w:top w:val="single" w:color="D1D5DB" w:sz="1"/>
+              <w:left w:val="single" w:color="D1D5DB" w:sz="1"/>
+              <w:bottom w:val="single" w:color="D1D5DB" w:sz="1"/>
+              <w:right w:val="single" w:color="D1D5DB" w:sz="1"/>
+            </w:tcBorders>
+            <w:shd w:fill="FFFFFF" w:val="clear"/>
+            <w:tcMar>
+              <w:top w:type="dxa" w:w="80"/>
+              <w:left w:type="dxa" w:w="150"/>
+              <w:bottom w:type="dxa" w:w="80"/>
+              <w:right w:type="dxa" w:w="150"/>
+            </w:tcMar>
+          </w:tcPr>
+          <w:p>
+            <w:pPr>
+              <w:spacing w:after="0" w:before="0"/>
+            </w:pPr>
+            <w:r>
+              <w:rPr>
+                <w:rFonts w:ascii="Arial" w:cs="Arial" w:eastAsia="Arial" w:hAnsi="Arial"/>
+                <w:color w:val="374151"/>
+                <w:sz w:val="20"/>
+                <w:szCs w:val="20"/>
+              </w:rPr>
+              <w:t xml:space="preserve">Async rate limiter. Computes elapsed since last Nominatim call. If &lt; 1.0 s, sleeps the remainder. Enforces Nominatim's fair-use policy of max 1 request/second.</w:t>
+            </w:r>
+          </w:p>
+        </w:tc>
+      </w:tr>
+      <w:tr>
+        <w:tc>
+          <w:tcPr>
+            <w:tcW w:type="dxa" w:w="2600"/>
+            <w:tcBorders>
+              <w:top w:val="single" w:color="D1D5DB" w:sz="1"/>
+              <w:left w:val="single" w:color="D1D5DB" w:sz="1"/>
+              <w:bottom w:val="single" w:color="D1D5DB" w:sz="1"/>
+              <w:right w:val="single" w:color="D1D5DB" w:sz="1"/>
+            </w:tcBorders>
+            <w:shd w:fill="EFF6FF" w:val="clear"/>
+            <w:tcMar>
+              <w:top w:type="dxa" w:w="80"/>
+              <w:left w:type="dxa" w:w="150"/>
+              <w:bottom w:type="dxa" w:w="80"/>
+              <w:right w:type="dxa" w:w="150"/>
+            </w:tcMar>
+          </w:tcPr>
+          <w:p>
+            <w:pPr>
+              <w:spacing w:after="0" w:before="0"/>
+            </w:pPr>
+            <w:r>
+              <w:rPr>
+                <w:rFonts w:ascii="Arial" w:cs="Arial" w:eastAsia="Arial" w:hAnsi="Arial"/>
+                <w:color w:val="374151"/>
+                <w:sz w:val="20"/>
+                <w:szCs w:val="20"/>
+              </w:rPr>
+              <w:t xml:space="preserve">_nominatim_lookup(city)</w:t>
+            </w:r>
+          </w:p>
+        </w:tc>
+        <w:tc>
+          <w:tcPr>
+            <w:tcW w:type="dxa" w:w="6760"/>
+            <w:tcBorders>
+              <w:top w:val="single" w:color="D1D5DB" w:sz="1"/>
+              <w:left w:val="single" w:color="D1D5DB" w:sz="1"/>
+              <w:bottom w:val="single" w:color="D1D5DB" w:sz="1"/>
+              <w:right w:val="single" w:color="D1D5DB" w:sz="1"/>
+            </w:tcBorders>
+            <w:shd w:fill="EFF6FF" w:val="clear"/>
+            <w:tcMar>
+              <w:top w:type="dxa" w:w="80"/>
+              <w:left w:type="dxa" w:w="150"/>
+              <w:bottom w:type="dxa" w:w="80"/>
+              <w:right w:type="dxa" w:w="150"/>
+            </w:tcMar>
+          </w:tcPr>
+          <w:p>
+            <w:pPr>
+              <w:spacing w:after="0" w:before="0"/>
+            </w:pPr>
+            <w:r>
+              <w:rPr>
+                <w:rFonts w:ascii="Arial" w:cs="Arial" w:eastAsia="Arial" w:hAnsi="Arial"/>
+                <w:color w:val="374151"/>
+                <w:sz w:val="20"/>
+                <w:szCs w:val="20"/>
+              </w:rPr>
+              <w:t xml:space="preserve">Calls Nominatim API with q=city, format=json, limit=1. Parses lat/lon from first result. Returns None on HTTP error, empty results, timeout, or any exception. Never raises.</w:t>
+            </w:r>
+          </w:p>
+        </w:tc>
+      </w:tr>
+      <w:tr>
+        <w:tc>
+          <w:tcPr>
+            <w:tcW w:type="dxa" w:w="2600"/>
+            <w:tcBorders>
+              <w:top w:val="single" w:color="D1D5DB" w:sz="1"/>
+              <w:left w:val="single" w:color="D1D5DB" w:sz="1"/>
+              <w:bottom w:val="single" w:color="D1D5DB" w:sz="1"/>
+              <w:right w:val="single" w:color="D1D5DB" w:sz="1"/>
+            </w:tcBorders>
+            <w:shd w:fill="FFFFFF" w:val="clear"/>
+            <w:tcMar>
+              <w:top w:type="dxa" w:w="80"/>
+              <w:left w:type="dxa" w:w="150"/>
+              <w:bottom w:type="dxa" w:w="80"/>
+              <w:right w:type="dxa" w:w="150"/>
+            </w:tcMar>
+          </w:tcPr>
+          <w:p>
+            <w:pPr>
+              <w:spacing w:after="0" w:before="0"/>
+            </w:pPr>
+            <w:r>
+              <w:rPr>
+                <w:rFonts w:ascii="Arial" w:cs="Arial" w:eastAsia="Arial" w:hAnsi="Arial"/>
+                <w:color w:val="374151"/>
+                <w:sz w:val="20"/>
+                <w:szCs w:val="20"/>
+              </w:rPr>
+              <w:t xml:space="preserve">resolve_city(city)</w:t>
+            </w:r>
+          </w:p>
+        </w:tc>
+        <w:tc>
+          <w:tcPr>
+            <w:tcW w:type="dxa" w:w="6760"/>
+            <w:tcBorders>
+              <w:top w:val="single" w:color="D1D5DB" w:sz="1"/>
+              <w:left w:val="single" w:color="D1D5DB" w:sz="1"/>
+              <w:bottom w:val="single" w:color="D1D5DB" w:sz="1"/>
+              <w:right w:val="single" w:color="D1D5DB" w:sz="1"/>
+            </w:tcBorders>
+            <w:shd w:fill="FFFFFF" w:val="clear"/>
+            <w:tcMar>
+              <w:top w:type="dxa" w:w="80"/>
+              <w:left w:type="dxa" w:w="150"/>
+              <w:bottom w:type="dxa" w:w="80"/>
+              <w:right w:type="dxa" w:w="150"/>
+            </w:tcMar>
+          </w:tcPr>
+          <w:p>
+            <w:pPr>
+              <w:spacing w:after="0" w:before="0"/>
+            </w:pPr>
+            <w:r>
+              <w:rPr>
+                <w:rFonts w:ascii="Arial" w:cs="Arial" w:eastAsia="Arial" w:hAnsi="Arial"/>
+                <w:color w:val="374151"/>
+                <w:sz w:val="20"/>
+                <w:szCs w:val="20"/>
+              </w:rPr>
+              <w:t xml:space="preserve">Primary entry point. Runs the 4-step resolution chain. Called by server.py register() when an agent provides a city name. Caches results (including None) to avoid repeated Nominatim calls.</w:t>
+            </w:r>
+          </w:p>
+        </w:tc>
+      </w:tr>
+      <w:tr>
+        <w:tc>
+          <w:tcPr>
+            <w:tcW w:type="dxa" w:w="2600"/>
+            <w:tcBorders>
+              <w:top w:val="single" w:color="D1D5DB" w:sz="1"/>
+              <w:left w:val="single" w:color="D1D5DB" w:sz="1"/>
+              <w:bottom w:val="single" w:color="D1D5DB" w:sz="1"/>
+              <w:right w:val="single" w:color="D1D5DB" w:sz="1"/>
+            </w:tcBorders>
+            <w:shd w:fill="EFF6FF" w:val="clear"/>
+            <w:tcMar>
+              <w:top w:type="dxa" w:w="80"/>
+              <w:left w:type="dxa" w:w="150"/>
+              <w:bottom w:type="dxa" w:w="80"/>
+              <w:right w:type="dxa" w:w="150"/>
+            </w:tcMar>
+          </w:tcPr>
+          <w:p>
+            <w:pPr>
+              <w:spacing w:after="0" w:before="0"/>
+            </w:pPr>
+            <w:r>
+              <w:rPr>
+                <w:rFonts w:ascii="Arial" w:cs="Arial" w:eastAsia="Arial" w:hAnsi="Arial"/>
+                <w:color w:val="374151"/>
+                <w:sz w:val="20"/>
+                <w:szCs w:val="20"/>
+              </w:rPr>
+              <w:t xml:space="preserve">geocode_cache_snapshot()</w:t>
+            </w:r>
+          </w:p>
+        </w:tc>
+        <w:tc>
+          <w:tcPr>
+            <w:tcW w:type="dxa" w:w="6760"/>
+            <w:tcBorders>
+              <w:top w:val="single" w:color="D1D5DB" w:sz="1"/>
+              <w:left w:val="single" w:color="D1D5DB" w:sz="1"/>
+              <w:bottom w:val="single" w:color="D1D5DB" w:sz="1"/>
+              <w:right w:val="single" w:color="D1D5DB" w:sz="1"/>
+            </w:tcBorders>
+            <w:shd w:fill="EFF6FF" w:val="clear"/>
+            <w:tcMar>
+              <w:top w:type="dxa" w:w="80"/>
+              <w:left w:type="dxa" w:w="150"/>
+              <w:bottom w:type="dxa" w:w="80"/>
+              <w:right w:type="dxa" w:w="150"/>
+            </w:tcMar>
+          </w:tcPr>
+          <w:p>
+            <w:pPr>
+              <w:spacing w:after="0" w:before="0"/>
+            </w:pPr>
+            <w:r>
+              <w:rPr>
+                <w:rFonts w:ascii="Arial" w:cs="Arial" w:eastAsia="Arial" w:hAnsi="Arial"/>
+                <w:color w:val="374151"/>
+                <w:sz w:val="20"/>
+                <w:szCs w:val="20"/>
+              </w:rPr>
+              <w:t xml:space="preserve">Returns a copy of _geocode_cache. Used by GET /health to show which cities have been geocoded and their resolved coordinates.</w:t>
+            </w:r>
+          </w:p>
+        </w:tc>
+      </w:tr>
+    </w:tbl>
+    <w:p>
+      <w:pPr>
+        <w:spacing w:after="120" w:before="0"/>
+      </w:pPr>
+      <w:r>
+        <w:t xml:space="preserve"/>
+      </w:r>
+    </w:p>
+    <w:p>
+      <w:pPr>
+        <w:pStyle w:val="Heading3"/>
+        <w:spacing w:after="80" w:before="240"/>
+      </w:pPr>
+      <w:r>
+        <w:rPr>
+          <w:rFonts w:ascii="Arial" w:cs="Arial" w:eastAsia="Arial" w:hAnsi="Arial"/>
+          <w:b/>
+          <w:bCs/>
+          <w:color w:val="374151"/>
+          <w:sz w:val="24"/>
+          <w:szCs w:val="24"/>
+        </w:rPr>
+        <w:t xml:space="preserve">Example: Agent registers with city name</w:t>
+      </w:r>
+    </w:p>
+    <w:tbl>
+      <w:tblPr>
+        <w:tblW w:type="dxa" w:w="9360"/>
+        <w:tblBorders>
+          <w:top w:val="single" w:color="auto" w:sz="4"/>
+          <w:left w:val="single" w:color="auto" w:sz="4"/>
+          <w:bottom w:val="single" w:color="auto" w:sz="4"/>
+          <w:right w:val="single" w:color="auto" w:sz="4"/>
+          <w:insideH w:val="single" w:color="auto" w:sz="4"/>
+          <w:insideV w:val="single" w:color="auto" w:sz="4"/>
+        </w:tblBorders>
+      </w:tblPr>
+      <w:tblGrid>
+        <w:gridCol w:w="9360"/>
+      </w:tblGrid>
+      <w:tr>
+        <w:tc>
+          <w:tcPr>
+            <w:tcW w:type="dxa" w:w="9360"/>
+            <w:tcBorders>
+              <w:top w:val="single" w:color="D1D5DB" w:sz="1"/>
+              <w:left w:val="single" w:color="D1D5DB" w:sz="1"/>
+              <w:bottom w:val="single" w:color="D1D5DB" w:sz="1"/>
+              <w:right w:val="single" w:color="D1D5DB" w:sz="1"/>
+            </w:tcBorders>
+            <w:shd w:fill="F3F4F6" w:val="clear"/>
+            <w:tcMar>
+              <w:top w:type="dxa" w:w="120"/>
+              <w:left w:type="dxa" w:w="200"/>
+              <w:bottom w:type="dxa" w:w="120"/>
+              <w:right w:type="dxa" w:w="200"/>
+            </w:tcMar>
+          </w:tcPr>
+          <w:p>
+            <w:pPr>
+              <w:spacing w:after="0" w:before="0"/>
+            </w:pPr>
+            <w:r>
+              <w:rPr>
+                <w:rFonts w:ascii="Courier New" w:cs="Courier New" w:eastAsia="Courier New" w:hAnsi="Courier New"/>
+                <w:color w:val="1F2937"/>
+                <w:sz w:val="18"/>
+                <w:szCs w:val="18"/>
+              </w:rPr>
+              <w:t xml:space="preserve">POST /register  { "label": "emailer", "endpoint": "http://host:9001",</w:t>
+            </w:r>
+          </w:p>
+          <w:p>
+            <w:pPr>
+              <w:spacing w:after="0" w:before="0"/>
+            </w:pPr>
+            <w:r>
+              <w:rPr>
+                <w:rFonts w:ascii="Courier New" w:cs="Courier New" w:eastAsia="Courier New" w:hAnsi="Courier New"/>
+                <w:color w:val="1F2937"/>
+                <w:sz w:val="18"/>
+                <w:szCs w:val="18"/>
+              </w:rPr>
+              <w:t xml:space="preserve">                  "location": {"city": "Hyderabad"} }</w:t>
+            </w:r>
+          </w:p>
+          <w:p>
+            <w:pPr>
+              <w:spacing w:after="0" w:before="0"/>
+            </w:pPr>
+            <w:r>
+              <w:rPr>
+                <w:rFonts w:ascii="Courier New" w:cs="Courier New" w:eastAsia="Courier New" w:hAnsi="Courier New"/>
+                <w:color w:val="1F2937"/>
+                <w:sz w:val="18"/>
+                <w:szCs w:val="18"/>
+              </w:rPr>
+              <w:t xml:space="preserve"> </w:t>
+            </w:r>
+          </w:p>
+          <w:p>
+            <w:pPr>
+              <w:spacing w:after="0" w:before="0"/>
+            </w:pPr>
+            <w:r>
+              <w:rPr>
+                <w:rFonts w:ascii="Courier New" w:cs="Courier New" w:eastAsia="Courier New" w:hAnsi="Courier New"/>
+                <w:color w:val="1F2937"/>
+                <w:sz w:val="18"/>
+                <w:szCs w:val="18"/>
+              </w:rPr>
+              <w:t xml:space="preserve">Step 1  'hyderabad' found in CITY_COORDS → (17.3850, 78.4867)  [instant]</w:t>
+            </w:r>
+          </w:p>
+          <w:p>
+            <w:pPr>
+              <w:spacing w:after="0" w:before="0"/>
+            </w:pPr>
+            <w:r>
+              <w:rPr>
+                <w:rFonts w:ascii="Courier New" w:cs="Courier New" w:eastAsia="Courier New" w:hAnsi="Courier New"/>
+                <w:color w:val="1F2937"/>
+                <w:sz w:val="18"/>
+                <w:szCs w:val="18"/>
+              </w:rPr>
+              <w:t xml:space="preserve">        location updated: { city, latitude: 17.385, longitude: 78.4867 }</w:t>
+            </w:r>
+          </w:p>
+          <w:p>
+            <w:pPr>
+              <w:spacing w:after="0" w:before="0"/>
+            </w:pPr>
+            <w:r>
+              <w:rPr>
+                <w:rFonts w:ascii="Courier New" w:cs="Courier New" w:eastAsia="Courier New" w:hAnsi="Courier New"/>
+                <w:color w:val="1F2937"/>
+                <w:sz w:val="18"/>
+                <w:szCs w:val="18"/>
+              </w:rPr>
+              <w:t xml:space="preserve">        geo_routing: active</w:t>
+            </w:r>
+          </w:p>
+          <w:p>
+            <w:pPr>
+              <w:spacing w:after="0" w:before="0"/>
+            </w:pPr>
+            <w:r>
+              <w:rPr>
+                <w:rFonts w:ascii="Courier New" w:cs="Courier New" w:eastAsia="Courier New" w:hAnsi="Courier New"/>
+                <w:color w:val="1F2937"/>
+                <w:sz w:val="18"/>
+                <w:szCs w:val="18"/>
+              </w:rPr>
+              <w:t xml:space="preserve"> </w:t>
+            </w:r>
+          </w:p>
+          <w:p>
+            <w:pPr>
+              <w:spacing w:after="0" w:before="0"/>
+            </w:pPr>
+            <w:r>
+              <w:rPr>
+                <w:rFonts w:ascii="Courier New" w:cs="Courier New" w:eastAsia="Courier New" w:hAnsi="Courier New"/>
+                <w:color w:val="1F2937"/>
+                <w:sz w:val="18"/>
+                <w:szCs w:val="18"/>
+              </w:rPr>
+              <w:t xml:space="preserve">POST /register  { "label": "emailer", "endpoint": "http://host:9001",</w:t>
+            </w:r>
+          </w:p>
+          <w:p>
+            <w:pPr>
+              <w:spacing w:after="0" w:before="0"/>
+            </w:pPr>
+            <w:r>
+              <w:rPr>
+                <w:rFonts w:ascii="Courier New" w:cs="Courier New" w:eastAsia="Courier New" w:hAnsi="Courier New"/>
+                <w:color w:val="1F2937"/>
+                <w:sz w:val="18"/>
+                <w:szCs w:val="18"/>
+              </w:rPr>
+              <w:t xml:space="preserve">                  "location": {"city": "Gdansk"} }</w:t>
+            </w:r>
+          </w:p>
+          <w:p>
+            <w:pPr>
+              <w:spacing w:after="0" w:before="0"/>
+            </w:pPr>
+            <w:r>
+              <w:rPr>
+                <w:rFonts w:ascii="Courier New" w:cs="Courier New" w:eastAsia="Courier New" w:hAnsi="Courier New"/>
+                <w:color w:val="1F2937"/>
+                <w:sz w:val="18"/>
+                <w:szCs w:val="18"/>
+              </w:rPr>
+              <w:t xml:space="preserve"> </w:t>
+            </w:r>
+          </w:p>
+          <w:p>
+            <w:pPr>
+              <w:spacing w:after="0" w:before="0"/>
+            </w:pPr>
+            <w:r>
+              <w:rPr>
+                <w:rFonts w:ascii="Courier New" w:cs="Courier New" w:eastAsia="Courier New" w:hAnsi="Courier New"/>
+                <w:color w:val="1F2937"/>
+                <w:sz w:val="18"/>
+                <w:szCs w:val="18"/>
+              </w:rPr>
+              <w:t xml:space="preserve">Step 1  'gdansk' NOT in CITY_COORDS</w:t>
+            </w:r>
+          </w:p>
+          <w:p>
+            <w:pPr>
+              <w:spacing w:after="0" w:before="0"/>
+            </w:pPr>
+            <w:r>
+              <w:rPr>
+                <w:rFonts w:ascii="Courier New" w:cs="Courier New" w:eastAsia="Courier New" w:hAnsi="Courier New"/>
+                <w:color w:val="1F2937"/>
+                <w:sz w:val="18"/>
+                <w:szCs w:val="18"/>
+              </w:rPr>
+              <w:t xml:space="preserve">Step 2  NOT in _geocode_cache</w:t>
+            </w:r>
+          </w:p>
+          <w:p>
+            <w:pPr>
+              <w:spacing w:after="0" w:before="0"/>
+            </w:pPr>
+            <w:r>
+              <w:rPr>
+                <w:rFonts w:ascii="Courier New" w:cs="Courier New" w:eastAsia="Courier New" w:hAnsi="Courier New"/>
+                <w:color w:val="1F2937"/>
+                <w:sz w:val="18"/>
+                <w:szCs w:val="18"/>
+              </w:rPr>
+              <w:t xml:space="preserve">Step 3  GEOCODING_ENABLED=true → _nominatim_lookup('Gdansk')</w:t>
+            </w:r>
+          </w:p>
+          <w:p>
+            <w:pPr>
+              <w:spacing w:after="0" w:before="0"/>
+            </w:pPr>
+            <w:r>
+              <w:rPr>
+                <w:rFonts w:ascii="Courier New" w:cs="Courier New" w:eastAsia="Courier New" w:hAnsi="Courier New"/>
+                <w:color w:val="1F2937"/>
+                <w:sz w:val="18"/>
+                <w:szCs w:val="18"/>
+              </w:rPr>
+              <w:t xml:space="preserve">        Nominatim returns lat=54.3521, lon=18.6464</w:t>
+            </w:r>
+          </w:p>
+          <w:p>
+            <w:pPr>
+              <w:spacing w:after="0" w:before="0"/>
+            </w:pPr>
+            <w:r>
+              <w:rPr>
+                <w:rFonts w:ascii="Courier New" w:cs="Courier New" w:eastAsia="Courier New" w:hAnsi="Courier New"/>
+                <w:color w:val="1F2937"/>
+                <w:sz w:val="18"/>
+                <w:szCs w:val="18"/>
+              </w:rPr>
+              <w:t xml:space="preserve">        _geocode_cache['gdansk'] = (54.3521, 18.6464)</w:t>
+            </w:r>
+          </w:p>
+          <w:p>
+            <w:pPr>
+              <w:spacing w:after="0" w:before="0"/>
+            </w:pPr>
+            <w:r>
+              <w:rPr>
+                <w:rFonts w:ascii="Courier New" w:cs="Courier New" w:eastAsia="Courier New" w:hAnsi="Courier New"/>
+                <w:color w:val="1F2937"/>
+                <w:sz w:val="18"/>
+                <w:szCs w:val="18"/>
+              </w:rPr>
+              <w:t xml:space="preserve">        geo_routing: active</w:t>
+            </w:r>
+          </w:p>
+          <w:p>
+            <w:pPr>
+              <w:spacing w:after="0" w:before="0"/>
+            </w:pPr>
+            <w:r>
+              <w:rPr>
+                <w:rFonts w:ascii="Courier New" w:cs="Courier New" w:eastAsia="Courier New" w:hAnsi="Courier New"/>
+                <w:color w:val="1F2937"/>
+                <w:sz w:val="18"/>
+                <w:szCs w:val="18"/>
+              </w:rPr>
+              <w:t xml:space="preserve"> </w:t>
+            </w:r>
+          </w:p>
+          <w:p>
+            <w:pPr>
+              <w:spacing w:after="0" w:before="0"/>
+            </w:pPr>
+            <w:r>
+              <w:rPr>
+                <w:rFonts w:ascii="Courier New" w:cs="Courier New" w:eastAsia="Courier New" w:hAnsi="Courier New"/>
+                <w:color w:val="1F2937"/>
+                <w:sz w:val="18"/>
+                <w:szCs w:val="18"/>
+              </w:rPr>
+              <w:t xml:space="preserve">POST /register  { "label": "emailer", "endpoint": "http://host:9001",</w:t>
+            </w:r>
+          </w:p>
+          <w:p>
+            <w:pPr>
+              <w:spacing w:after="0" w:before="0"/>
+            </w:pPr>
+            <w:r>
+              <w:rPr>
+                <w:rFonts w:ascii="Courier New" w:cs="Courier New" w:eastAsia="Courier New" w:hAnsi="Courier New"/>
+                <w:color w:val="1F2937"/>
+                <w:sz w:val="18"/>
+                <w:szCs w:val="18"/>
+              </w:rPr>
+              <w:t xml:space="preserve">                  "location": {"city": "Unknown City XYZ"} }</w:t>
+            </w:r>
+          </w:p>
+          <w:p>
+            <w:pPr>
+              <w:spacing w:after="0" w:before="0"/>
+            </w:pPr>
+            <w:r>
+              <w:rPr>
+                <w:rFonts w:ascii="Courier New" w:cs="Courier New" w:eastAsia="Courier New" w:hAnsi="Courier New"/>
+                <w:color w:val="1F2937"/>
+                <w:sz w:val="18"/>
+                <w:szCs w:val="18"/>
+              </w:rPr>
+              <w:t xml:space="preserve"> </w:t>
+            </w:r>
+          </w:p>
+          <w:p>
+            <w:pPr>
+              <w:spacing w:after="0" w:before="0"/>
+            </w:pPr>
+            <w:r>
+              <w:rPr>
+                <w:rFonts w:ascii="Courier New" w:cs="Courier New" w:eastAsia="Courier New" w:hAnsi="Courier New"/>
+                <w:color w:val="1F2937"/>
+                <w:sz w:val="18"/>
+                <w:szCs w:val="18"/>
+              </w:rPr>
+              <w:t xml:space="preserve">Step 1-3  Not found in table, not in cache, Nominatim returns no results</w:t>
+            </w:r>
+          </w:p>
+          <w:p>
+            <w:pPr>
+              <w:spacing w:after="0" w:before="0"/>
+            </w:pPr>
+            <w:r>
+              <w:rPr>
+                <w:rFonts w:ascii="Courier New" w:cs="Courier New" w:eastAsia="Courier New" w:hAnsi="Courier New"/>
+                <w:color w:val="1F2937"/>
+                <w:sz w:val="18"/>
+                <w:szCs w:val="18"/>
+              </w:rPr>
+              <w:t xml:space="preserve">          _geocode_cache['unknown city xyz'] = None</w:t>
+            </w:r>
+          </w:p>
+          <w:p>
+            <w:pPr>
+              <w:spacing w:after="0" w:before="0"/>
+            </w:pPr>
+            <w:r>
+              <w:rPr>
+                <w:rFonts w:ascii="Courier New" w:cs="Courier New" w:eastAsia="Courier New" w:hAnsi="Courier New"/>
+                <w:color w:val="1F2937"/>
+                <w:sz w:val="18"/>
+                <w:szCs w:val="18"/>
+              </w:rPr>
+              <w:t xml:space="preserve">          geo_routing: disabled — endpoint still registered normally</w:t>
+            </w:r>
+          </w:p>
+        </w:tc>
+      </w:tr>
+    </w:tbl>
+    <w:p>
+      <w:pPr>
+        <w:spacing w:after="160" w:before="0"/>
+      </w:pPr>
+      <w:r>
+        <w:t xml:space="preserve"/>
+      </w:r>
+    </w:p>
+    <w:p>
+      <w:r>
+        <w:br w:type="page"/>
+      </w:r>
+    </w:p>
+    <w:p>
+      <w:pPr>
         <w:pStyle w:val="Heading1"/>
         <w:pBdr>
           <w:bottom w:val="single" w:color="1B3A6B" w:sz="8" w:space="4"/>
@@ -18035,6 +20558,136 @@
           </w:p>
         </w:tc>
       </w:tr>
+      <w:tr>
+        <w:tc>
+          <w:tcPr>
+            <w:tcW w:type="dxa" w:w="2600"/>
+            <w:tcBorders>
+              <w:top w:val="single" w:color="D1D5DB" w:sz="1"/>
+              <w:left w:val="single" w:color="D1D5DB" w:sz="1"/>
+              <w:bottom w:val="single" w:color="D1D5DB" w:sz="1"/>
+              <w:right w:val="single" w:color="D1D5DB" w:sz="1"/>
+            </w:tcBorders>
+            <w:shd w:fill="EFF6FF" w:val="clear"/>
+            <w:tcMar>
+              <w:top w:type="dxa" w:w="80"/>
+              <w:left w:type="dxa" w:w="150"/>
+              <w:bottom w:type="dxa" w:w="80"/>
+              <w:right w:type="dxa" w:w="150"/>
+            </w:tcMar>
+          </w:tcPr>
+          <w:p>
+            <w:pPr>
+              <w:spacing w:after="0" w:before="0"/>
+            </w:pPr>
+            <w:r>
+              <w:rPr>
+                <w:rFonts w:ascii="Arial" w:cs="Arial" w:eastAsia="Arial" w:hAnsi="Arial"/>
+                <w:color w:val="374151"/>
+                <w:sz w:val="20"/>
+                <w:szCs w:val="20"/>
+              </w:rPr>
+              <w:t xml:space="preserve">AGENTNS_GEOCODING</w:t>
+            </w:r>
+          </w:p>
+        </w:tc>
+        <w:tc>
+          <w:tcPr>
+            <w:tcW w:type="dxa" w:w="2000"/>
+            <w:tcBorders>
+              <w:top w:val="single" w:color="D1D5DB" w:sz="1"/>
+              <w:left w:val="single" w:color="D1D5DB" w:sz="1"/>
+              <w:bottom w:val="single" w:color="D1D5DB" w:sz="1"/>
+              <w:right w:val="single" w:color="D1D5DB" w:sz="1"/>
+            </w:tcBorders>
+            <w:shd w:fill="EFF6FF" w:val="clear"/>
+            <w:tcMar>
+              <w:top w:type="dxa" w:w="80"/>
+              <w:left w:type="dxa" w:w="150"/>
+              <w:bottom w:type="dxa" w:w="80"/>
+              <w:right w:type="dxa" w:w="150"/>
+            </w:tcMar>
+          </w:tcPr>
+          <w:p>
+            <w:pPr>
+              <w:spacing w:after="0" w:before="0"/>
+            </w:pPr>
+            <w:r>
+              <w:rPr>
+                <w:rFonts w:ascii="Arial" w:cs="Arial" w:eastAsia="Arial" w:hAnsi="Arial"/>
+                <w:color w:val="374151"/>
+                <w:sz w:val="20"/>
+                <w:szCs w:val="20"/>
+              </w:rPr>
+              <w:t xml:space="preserve">on</w:t>
+            </w:r>
+          </w:p>
+        </w:tc>
+        <w:tc>
+          <w:tcPr>
+            <w:tcW w:type="dxa" w:w="900"/>
+            <w:tcBorders>
+              <w:top w:val="single" w:color="D1D5DB" w:sz="1"/>
+              <w:left w:val="single" w:color="D1D5DB" w:sz="1"/>
+              <w:bottom w:val="single" w:color="D1D5DB" w:sz="1"/>
+              <w:right w:val="single" w:color="D1D5DB" w:sz="1"/>
+            </w:tcBorders>
+            <w:shd w:fill="EFF6FF" w:val="clear"/>
+            <w:tcMar>
+              <w:top w:type="dxa" w:w="80"/>
+              <w:left w:type="dxa" w:w="150"/>
+              <w:bottom w:type="dxa" w:w="80"/>
+              <w:right w:type="dxa" w:w="150"/>
+            </w:tcMar>
+          </w:tcPr>
+          <w:p>
+            <w:pPr>
+              <w:spacing w:after="0" w:before="0"/>
+            </w:pPr>
+            <w:r>
+              <w:rPr>
+                <w:rFonts w:ascii="Arial" w:cs="Arial" w:eastAsia="Arial" w:hAnsi="Arial"/>
+                <w:color w:val="374151"/>
+                <w:sz w:val="20"/>
+                <w:szCs w:val="20"/>
+              </w:rPr>
+              <w:t xml:space="preserve">str</w:t>
+            </w:r>
+          </w:p>
+        </w:tc>
+        <w:tc>
+          <w:tcPr>
+            <w:tcW w:type="dxa" w:w="3860"/>
+            <w:tcBorders>
+              <w:top w:val="single" w:color="D1D5DB" w:sz="1"/>
+              <w:left w:val="single" w:color="D1D5DB" w:sz="1"/>
+              <w:bottom w:val="single" w:color="D1D5DB" w:sz="1"/>
+              <w:right w:val="single" w:color="D1D5DB" w:sz="1"/>
+            </w:tcBorders>
+            <w:shd w:fill="EFF6FF" w:val="clear"/>
+            <w:tcMar>
+              <w:top w:type="dxa" w:w="80"/>
+              <w:left w:type="dxa" w:w="150"/>
+              <w:bottom w:type="dxa" w:w="80"/>
+              <w:right w:type="dxa" w:w="150"/>
+            </w:tcMar>
+          </w:tcPr>
+          <w:p>
+            <w:pPr>
+              <w:spacing w:after="0" w:before="0"/>
+            </w:pPr>
+            <w:r>
+              <w:rPr>
+                <w:rFonts w:ascii="Arial" w:cs="Arial" w:eastAsia="Arial" w:hAnsi="Arial"/>
+                <w:color w:val="374151"/>
+                <w:sz w:val="20"/>
+                <w:szCs w:val="20"/>
+              </w:rPr>
+              <w:t xml:space="preserve">Set to 'off' to disable Nominatim geocoding (air-gapped environments). Built-in CITY_COORDS table and explicit lat/lon still work.</w:t>
+            </w:r>
+          </w:p>
+        </w:tc>
+      </w:tr>
     </w:tbl>
     <w:p>
       <w:pPr>
@@ -19663,6 +22316,72 @@
                 <w:sz w:val="20"/>
                 <w:szCs w:val="20"/>
               </w:rPr>
+              <w:t xml:space="preserve">403</w:t>
+            </w:r>
+          </w:p>
+        </w:tc>
+        <w:tc>
+          <w:tcPr>
+            <w:tcW w:type="dxa" w:w="8160"/>
+            <w:tcBorders>
+              <w:top w:val="single" w:color="D1D5DB" w:sz="1"/>
+              <w:left w:val="single" w:color="D1D5DB" w:sz="1"/>
+              <w:bottom w:val="single" w:color="D1D5DB" w:sz="1"/>
+              <w:right w:val="single" w:color="D1D5DB" w:sz="1"/>
+            </w:tcBorders>
+            <w:shd w:fill="FFFFFF" w:val="clear"/>
+            <w:tcMar>
+              <w:top w:type="dxa" w:w="80"/>
+              <w:left w:type="dxa" w:w="150"/>
+              <w:bottom w:type="dxa" w:w="80"/>
+              <w:right w:type="dxa" w:w="150"/>
+            </w:tcMar>
+          </w:tcPr>
+          <w:p>
+            <w:pPr>
+              <w:spacing w:after="0" w:before="0"/>
+            </w:pPr>
+            <w:r>
+              <w:rPr>
+                <w:rFonts w:ascii="Arial" w:cs="Arial" w:eastAsia="Arial" w:hAnsi="Arial"/>
+                <w:color w:val="374151"/>
+                <w:sz w:val="20"/>
+                <w:szCs w:val="20"/>
+              </w:rPr>
+              <w:t xml:space="preserve">URN's TLD does not match AGENTNS_TLD (wrong nameserver), or URN's namespace does not match AGENTNS_NAMESPACE (wrong namespace). Plain labels never trigger 403.</w:t>
+            </w:r>
+          </w:p>
+        </w:tc>
+      </w:tr>
+      <w:tr>
+        <w:tc>
+          <w:tcPr>
+            <w:tcW w:type="dxa" w:w="1200"/>
+            <w:tcBorders>
+              <w:top w:val="single" w:color="D1D5DB" w:sz="1"/>
+              <w:left w:val="single" w:color="D1D5DB" w:sz="1"/>
+              <w:bottom w:val="single" w:color="D1D5DB" w:sz="1"/>
+              <w:right w:val="single" w:color="D1D5DB" w:sz="1"/>
+            </w:tcBorders>
+            <w:shd w:fill="EFF6FF" w:val="clear"/>
+            <w:tcMar>
+              <w:top w:type="dxa" w:w="80"/>
+              <w:left w:type="dxa" w:w="150"/>
+              <w:bottom w:type="dxa" w:w="80"/>
+              <w:right w:type="dxa" w:w="150"/>
+            </w:tcMar>
+          </w:tcPr>
+          <w:p>
+            <w:pPr>
+              <w:spacing w:after="0" w:before="0"/>
+            </w:pPr>
+            <w:r>
+              <w:rPr>
+                <w:rFonts w:ascii="Arial" w:cs="Arial" w:eastAsia="Arial" w:hAnsi="Arial"/>
+                <w:color w:val="374151"/>
+                <w:sz w:val="20"/>
+                <w:szCs w:val="20"/>
+              </w:rPr>
               <w:t xml:space="preserve">404</w:t>
             </w:r>
           </w:p>
@@ -19676,7 +22395,7 @@
               <w:bottom w:val="single" w:color="D1D5DB" w:sz="1"/>
               <w:right w:val="single" w:color="D1D5DB" w:sz="1"/>
             </w:tcBorders>
-            <w:shd w:fill="FFFFFF" w:val="clear"/>
+            <w:shd w:fill="EFF6FF" w:val="clear"/>
             <w:tcMar>
               <w:top w:type="dxa" w:w="80"/>
               <w:left w:type="dxa" w:w="150"/>
@@ -20533,7 +23252,7 @@
                 <w:sz w:val="20"/>
                 <w:szCs w:val="20"/>
               </w:rPr>
-              <w:t xml:space="preserve">City name not in CITY_COORDS</w:t>
+              <w:t xml:space="preserve">City name not in CITY_COORDS (registration)</w:t>
             </w:r>
           </w:p>
         </w:tc>
@@ -20565,7 +23284,271 @@
                 <w:sz w:val="20"/>
                 <w:szCs w:val="20"/>
               </w:rPr>
-              <w:t xml:space="preserve">_resolve_location() returns None. Geo disabled for that request.</w:t>
+              <w:t xml:space="preserve">geocoder.py tries Nominatim API. On success: coordinates injected, geo-routing active. On failure: warning logged, endpoint registered without coordinates, geo-routing disabled for that endpoint only.</w:t>
+            </w:r>
+          </w:p>
+        </w:tc>
+      </w:tr>
+      <w:tr>
+        <w:tc>
+          <w:tcPr>
+            <w:tcW w:type="dxa" w:w="3200"/>
+            <w:tcBorders>
+              <w:top w:val="single" w:color="D1D5DB" w:sz="1"/>
+              <w:left w:val="single" w:color="D1D5DB" w:sz="1"/>
+              <w:bottom w:val="single" w:color="D1D5DB" w:sz="1"/>
+              <w:right w:val="single" w:color="D1D5DB" w:sz="1"/>
+            </w:tcBorders>
+            <w:shd w:fill="EFF6FF" w:val="clear"/>
+            <w:tcMar>
+              <w:top w:type="dxa" w:w="80"/>
+              <w:left w:type="dxa" w:w="150"/>
+              <w:bottom w:type="dxa" w:w="80"/>
+              <w:right w:type="dxa" w:w="150"/>
+            </w:tcMar>
+          </w:tcPr>
+          <w:p>
+            <w:pPr>
+              <w:spacing w:after="0" w:before="0"/>
+            </w:pPr>
+            <w:r>
+              <w:rPr>
+                <w:rFonts w:ascii="Arial" w:cs="Arial" w:eastAsia="Arial" w:hAnsi="Arial"/>
+                <w:color w:val="374151"/>
+                <w:sz w:val="20"/>
+                <w:szCs w:val="20"/>
+              </w:rPr>
+              <w:t xml:space="preserve">City name not in CITY_COORDS (resolve requester_context)</w:t>
+            </w:r>
+          </w:p>
+        </w:tc>
+        <w:tc>
+          <w:tcPr>
+            <w:tcW w:type="dxa" w:w="6160"/>
+            <w:tcBorders>
+              <w:top w:val="single" w:color="D1D5DB" w:sz="1"/>
+              <w:left w:val="single" w:color="D1D5DB" w:sz="1"/>
+              <w:bottom w:val="single" w:color="D1D5DB" w:sz="1"/>
+              <w:right w:val="single" w:color="D1D5DB" w:sz="1"/>
+            </w:tcBorders>
+            <w:shd w:fill="EFF6FF" w:val="clear"/>
+            <w:tcMar>
+              <w:top w:type="dxa" w:w="80"/>
+              <w:left w:type="dxa" w:w="150"/>
+              <w:bottom w:type="dxa" w:w="80"/>
+              <w:right w:type="dxa" w:w="150"/>
+            </w:tcMar>
+          </w:tcPr>
+          <w:p>
+            <w:pPr>
+              <w:spacing w:after="0" w:before="0"/>
+            </w:pPr>
+            <w:r>
+              <w:rPr>
+                <w:rFonts w:ascii="Arial" w:cs="Arial" w:eastAsia="Arial" w:hAnsi="Arial"/>
+                <w:color w:val="374151"/>
+                <w:sz w:val="20"/>
+                <w:szCs w:val="20"/>
+              </w:rPr>
+              <w:t xml:space="preserve">_resolve_location() returns None (built-in table only). Geo distance = math.inf — ranking falls through to latency tiebreaker.</w:t>
+            </w:r>
+          </w:p>
+        </w:tc>
+      </w:tr>
+      <w:tr>
+        <w:tc>
+          <w:tcPr>
+            <w:tcW w:type="dxa" w:w="3200"/>
+            <w:tcBorders>
+              <w:top w:val="single" w:color="D1D5DB" w:sz="1"/>
+              <w:left w:val="single" w:color="D1D5DB" w:sz="1"/>
+              <w:bottom w:val="single" w:color="D1D5DB" w:sz="1"/>
+              <w:right w:val="single" w:color="D1D5DB" w:sz="1"/>
+            </w:tcBorders>
+            <w:shd w:fill="FFFFFF" w:val="clear"/>
+            <w:tcMar>
+              <w:top w:type="dxa" w:w="80"/>
+              <w:left w:type="dxa" w:w="150"/>
+              <w:bottom w:type="dxa" w:w="80"/>
+              <w:right w:type="dxa" w:w="150"/>
+            </w:tcMar>
+          </w:tcPr>
+          <w:p>
+            <w:pPr>
+              <w:spacing w:after="0" w:before="0"/>
+            </w:pPr>
+            <w:r>
+              <w:rPr>
+                <w:rFonts w:ascii="Arial" w:cs="Arial" w:eastAsia="Arial" w:hAnsi="Arial"/>
+                <w:color w:val="374151"/>
+                <w:sz w:val="20"/>
+                <w:szCs w:val="20"/>
+              </w:rPr>
+              <w:t xml:space="preserve">Nominatim API unreachable / timeout</w:t>
+            </w:r>
+          </w:p>
+        </w:tc>
+        <w:tc>
+          <w:tcPr>
+            <w:tcW w:type="dxa" w:w="6160"/>
+            <w:tcBorders>
+              <w:top w:val="single" w:color="D1D5DB" w:sz="1"/>
+              <w:left w:val="single" w:color="D1D5DB" w:sz="1"/>
+              <w:bottom w:val="single" w:color="D1D5DB" w:sz="1"/>
+              <w:right w:val="single" w:color="D1D5DB" w:sz="1"/>
+            </w:tcBorders>
+            <w:shd w:fill="FFFFFF" w:val="clear"/>
+            <w:tcMar>
+              <w:top w:type="dxa" w:w="80"/>
+              <w:left w:type="dxa" w:w="150"/>
+              <w:bottom w:type="dxa" w:w="80"/>
+              <w:right w:type="dxa" w:w="150"/>
+            </w:tcMar>
+          </w:tcPr>
+          <w:p>
+            <w:pPr>
+              <w:spacing w:after="0" w:before="0"/>
+            </w:pPr>
+            <w:r>
+              <w:rPr>
+                <w:rFonts w:ascii="Arial" w:cs="Arial" w:eastAsia="Arial" w:hAnsi="Arial"/>
+                <w:color w:val="374151"/>
+                <w:sz w:val="20"/>
+                <w:szCs w:val="20"/>
+              </w:rPr>
+              <w:t xml:space="preserve">Returns None. Endpoint still registered. Geo disabled. Warning logged with suggestion to pass explicit lat/lon.</w:t>
+            </w:r>
+          </w:p>
+        </w:tc>
+      </w:tr>
+      <w:tr>
+        <w:tc>
+          <w:tcPr>
+            <w:tcW w:type="dxa" w:w="3200"/>
+            <w:tcBorders>
+              <w:top w:val="single" w:color="D1D5DB" w:sz="1"/>
+              <w:left w:val="single" w:color="D1D5DB" w:sz="1"/>
+              <w:bottom w:val="single" w:color="D1D5DB" w:sz="1"/>
+              <w:right w:val="single" w:color="D1D5DB" w:sz="1"/>
+            </w:tcBorders>
+            <w:shd w:fill="EFF6FF" w:val="clear"/>
+            <w:tcMar>
+              <w:top w:type="dxa" w:w="80"/>
+              <w:left w:type="dxa" w:w="150"/>
+              <w:bottom w:type="dxa" w:w="80"/>
+              <w:right w:type="dxa" w:w="150"/>
+            </w:tcMar>
+          </w:tcPr>
+          <w:p>
+            <w:pPr>
+              <w:spacing w:after="0" w:before="0"/>
+            </w:pPr>
+            <w:r>
+              <w:rPr>
+                <w:rFonts w:ascii="Arial" w:cs="Arial" w:eastAsia="Arial" w:hAnsi="Arial"/>
+                <w:color w:val="374151"/>
+                <w:sz w:val="20"/>
+                <w:szCs w:val="20"/>
+              </w:rPr>
+              <w:t xml:space="preserve">URN TLD mismatch in resolve</w:t>
+            </w:r>
+          </w:p>
+        </w:tc>
+        <w:tc>
+          <w:tcPr>
+            <w:tcW w:type="dxa" w:w="6160"/>
+            <w:tcBorders>
+              <w:top w:val="single" w:color="D1D5DB" w:sz="1"/>
+              <w:left w:val="single" w:color="D1D5DB" w:sz="1"/>
+              <w:bottom w:val="single" w:color="D1D5DB" w:sz="1"/>
+              <w:right w:val="single" w:color="D1D5DB" w:sz="1"/>
+            </w:tcBorders>
+            <w:shd w:fill="EFF6FF" w:val="clear"/>
+            <w:tcMar>
+              <w:top w:type="dxa" w:w="80"/>
+              <w:left w:type="dxa" w:w="150"/>
+              <w:bottom w:type="dxa" w:w="80"/>
+              <w:right w:type="dxa" w:w="150"/>
+            </w:tcMar>
+          </w:tcPr>
+          <w:p>
+            <w:pPr>
+              <w:spacing w:after="0" w:before="0"/>
+            </w:pPr>
+            <w:r>
+              <w:rPr>
+                <w:rFonts w:ascii="Arial" w:cs="Arial" w:eastAsia="Arial" w:hAnsi="Arial"/>
+                <w:color w:val="374151"/>
+                <w:sz w:val="20"/>
+                <w:szCs w:val="20"/>
+              </w:rPr>
+              <w:t xml:space="preserve">HTTP 403 returned. No lookup performed. Detail message names the correct vs received TLD.</w:t>
+            </w:r>
+          </w:p>
+        </w:tc>
+      </w:tr>
+      <w:tr>
+        <w:tc>
+          <w:tcPr>
+            <w:tcW w:type="dxa" w:w="3200"/>
+            <w:tcBorders>
+              <w:top w:val="single" w:color="D1D5DB" w:sz="1"/>
+              <w:left w:val="single" w:color="D1D5DB" w:sz="1"/>
+              <w:bottom w:val="single" w:color="D1D5DB" w:sz="1"/>
+              <w:right w:val="single" w:color="D1D5DB" w:sz="1"/>
+            </w:tcBorders>
+            <w:shd w:fill="FFFFFF" w:val="clear"/>
+            <w:tcMar>
+              <w:top w:type="dxa" w:w="80"/>
+              <w:left w:type="dxa" w:w="150"/>
+              <w:bottom w:type="dxa" w:w="80"/>
+              <w:right w:type="dxa" w:w="150"/>
+            </w:tcMar>
+          </w:tcPr>
+          <w:p>
+            <w:pPr>
+              <w:spacing w:after="0" w:before="0"/>
+            </w:pPr>
+            <w:r>
+              <w:rPr>
+                <w:rFonts w:ascii="Arial" w:cs="Arial" w:eastAsia="Arial" w:hAnsi="Arial"/>
+                <w:color w:val="374151"/>
+                <w:sz w:val="20"/>
+                <w:szCs w:val="20"/>
+              </w:rPr>
+              <w:t xml:space="preserve">URN namespace mismatch in resolve</w:t>
+            </w:r>
+          </w:p>
+        </w:tc>
+        <w:tc>
+          <w:tcPr>
+            <w:tcW w:type="dxa" w:w="6160"/>
+            <w:tcBorders>
+              <w:top w:val="single" w:color="D1D5DB" w:sz="1"/>
+              <w:left w:val="single" w:color="D1D5DB" w:sz="1"/>
+              <w:bottom w:val="single" w:color="D1D5DB" w:sz="1"/>
+              <w:right w:val="single" w:color="D1D5DB" w:sz="1"/>
+            </w:tcBorders>
+            <w:shd w:fill="FFFFFF" w:val="clear"/>
+            <w:tcMar>
+              <w:top w:type="dxa" w:w="80"/>
+              <w:left w:type="dxa" w:w="150"/>
+              <w:bottom w:type="dxa" w:w="80"/>
+              <w:right w:type="dxa" w:w="150"/>
+            </w:tcMar>
+          </w:tcPr>
+          <w:p>
+            <w:pPr>
+              <w:spacing w:after="0" w:before="0"/>
+            </w:pPr>
+            <w:r>
+              <w:rPr>
+                <w:rFonts w:ascii="Arial" w:cs="Arial" w:eastAsia="Arial" w:hAnsi="Arial"/>
+                <w:color w:val="374151"/>
+                <w:sz w:val="20"/>
+                <w:szCs w:val="20"/>
+              </w:rPr>
+              <w:t xml:space="preserve">HTTP 403 returned. No lookup performed. Detail message names the correct namespace.</w:t>
             </w:r>
           </w:p>
         </w:tc>

</xml_diff>